<commit_message>
IOLG-135: User Document 0.3, brought up to main at cd98ce8 plus PR #52
PR #43 merged on 30 Sep, so its labels are removed. The practice quiz
(PR #52) is added to the settings, the command chapter and the student
page walkthrough, marked as unmerged. The export table in chapter 10
described columns that do not exist and now matches export-schema.md.
Chapter 8 records the Sprint 5 cluster review and the reviewer-file
pattern; chapter 12 confirms the dashboard has no Moodle source; chapter
22 answers the filter question; chapter 23 adds findings UAT-01 and
UAT-02. Word and PDF rebuilt.

Co-Authored-By: Claude Fable 5.1 <noreply@anthropic.com>
</commit_message>
<xml_diff>
--- a/docs/handover/user-document.docx
+++ b/docs/handover/user-document.docx
@@ -73,7 +73,7 @@
               <w:jc w:val="left"/>
             </w:pPr>
             <w:r>
-              <w:t xml:space="preserve">DRAFT 0.2 — for team review. Part A is complete. Parts B and C are filled from the code and a live run; items marked ⚠</w:t>
+              <w:t xml:space="preserve">DRAFT 0.3 — for team review. Part A is complete. Parts B and C are filled from the code and a live run; items marked ⚠</w:t>
             </w:r>
             <w:r>
               <w:t xml:space="preserve"> </w:t>
@@ -135,7 +135,7 @@
               <w:jc w:val="left"/>
             </w:pPr>
             <w:r>
-              <w:t xml:space="preserve">30 September 2026</w:t>
+              <w:t xml:space="preserve">2 October 2026</w:t>
             </w:r>
           </w:p>
         </w:tc>
@@ -183,13 +183,13 @@
               <w:rPr>
                 <w:rStyle w:val="VerbatimChar"/>
               </w:rPr>
-              <w:t xml:space="preserve">fc68c3e</w:t>
+              <w:t xml:space="preserve">cd98ce8</w:t>
             </w:r>
             <w:r>
               <w:t xml:space="preserve"> </w:t>
             </w:r>
             <w:r>
-              <w:t xml:space="preserve">(29 Sep 2026) plus the dashboard pages of open pull request #43 (IOLG-134), which are marked</w:t>
+              <w:t xml:space="preserve">(2 Oct 2026). The practice quiz, which is in open pull request #52 (IOLG-136), is marked</w:t>
             </w:r>
             <w:r>
               <w:t xml:space="preserve"> </w:t>
@@ -199,13 +199,13 @@
                 <w:bCs/>
                 <w:b/>
               </w:rPr>
-              <w:t xml:space="preserve">(PR #43)</w:t>
+              <w:t xml:space="preserve">(PR #52)</w:t>
             </w:r>
             <w:r>
               <w:t xml:space="preserve"> </w:t>
             </w:r>
             <w:r>
-              <w:t xml:space="preserve">where they appear</w:t>
+              <w:t xml:space="preserve">where it appears</w:t>
             </w:r>
           </w:p>
         </w:tc>
@@ -4618,7 +4618,7 @@
               <w:t xml:space="preserve"> </w:t>
             </w:r>
             <w:r>
-              <w:t xml:space="preserve">uses the Anthropic API. Needed for clustering, learning plans and study strategies. Never used by the dashboard or the export.</w:t>
+              <w:t xml:space="preserve">uses the Anthropic API. Needed for clustering, learning plans, study strategies and quizzes. Never used by the dashboard or the export.</w:t>
             </w:r>
           </w:p>
         </w:tc>
@@ -5002,6 +5002,84 @@
             </w:pPr>
             <w:r>
               <w:t xml:space="preserve">What the dashboard opens when started with no flags (Part C, §13).</w:t>
+            </w:r>
+          </w:p>
+        </w:tc>
+      </w:tr>
+      <w:tr>
+        <w:tc>
+          <w:tcPr/>
+          <w:p>
+            <w:pPr>
+              <w:pStyle w:val="Compact"/>
+              <w:jc w:val="left"/>
+            </w:pPr>
+            <w:r>
+              <w:rPr>
+                <w:rStyle w:val="VerbatimChar"/>
+              </w:rPr>
+              <w:t xml:space="preserve">LJA_DASHBOARD_QUIZZES_DIR</w:t>
+            </w:r>
+            <w:r>
+              <w:t xml:space="preserve">,</w:t>
+            </w:r>
+            <w:r>
+              <w:t xml:space="preserve"> </w:t>
+            </w:r>
+            <w:r>
+              <w:rPr>
+                <w:rStyle w:val="VerbatimChar"/>
+              </w:rPr>
+              <w:t xml:space="preserve">LJA_QUIZ_CATALOGUE</w:t>
+            </w:r>
+            <w:r>
+              <w:t xml:space="preserve"> </w:t>
+            </w:r>
+            <w:r>
+              <w:rPr>
+                <w:bCs/>
+                <w:b/>
+              </w:rPr>
+              <w:t xml:space="preserve">(PR #52)</w:t>
+            </w:r>
+          </w:p>
+        </w:tc>
+        <w:tc>
+          <w:tcPr/>
+          <w:p>
+            <w:pPr>
+              <w:pStyle w:val="Compact"/>
+              <w:jc w:val="left"/>
+            </w:pPr>
+            <w:r>
+              <w:rPr>
+                <w:rStyle w:val="VerbatimChar"/>
+              </w:rPr>
+              <w:t xml:space="preserve">output/quizzes</w:t>
+            </w:r>
+            <w:r>
+              <w:t xml:space="preserve">,</w:t>
+            </w:r>
+            <w:r>
+              <w:t xml:space="preserve"> </w:t>
+            </w:r>
+            <w:r>
+              <w:rPr>
+                <w:rStyle w:val="VerbatimChar"/>
+              </w:rPr>
+              <w:t xml:space="preserve">../data-fixtures/subject_catalogue.yaml</w:t>
+            </w:r>
+          </w:p>
+        </w:tc>
+        <w:tc>
+          <w:tcPr/>
+          <w:p>
+            <w:pPr>
+              <w:pStyle w:val="Compact"/>
+              <w:jc w:val="left"/>
+            </w:pPr>
+            <w:r>
+              <w:t xml:space="preserve">Where the dashboard looks for practice quizzes, and the catalogue the quiz command reads subject titles and handbook synopses from.</w:t>
             </w:r>
           </w:p>
         </w:tc>
@@ -7805,7 +7883,61 @@
         <w:t xml:space="preserve"> </w:t>
       </w:r>
       <w:r>
-        <w:t xml:space="preserve">Read the rationale against the member SILOs’ wording, not against the label. Reject when members are the same skill in name only (the prompt’s own counter-example is written reporting versus oral presentation), or when a group is one whole subject rather than one skill. Single-subject groups are legitimate when the rationale says no equivalent was found elsewhere. A flagged vague SILO is feedback for its coordinator, not a reason to reject the group it sits in. ⚠</w:t>
+        <w:t xml:space="preserve">Read the rationale against the member SILOs’ wording, not against the label. Reject when members are the same skill in name only (the prompt’s own counter-example is written reporting versus oral presentation), or when a group is one whole subject rather than one skill. Single-subject groups are legitimate when the rationale says no equivalent was found elsewhere. A flagged vague SILO is feedback for its coordinator, not a reason to reject the group it sits in.</w:t>
+      </w:r>
+    </w:p>
+    <w:p>
+      <w:pPr>
+        <w:pStyle w:val="BodyText"/>
+      </w:pPr>
+      <w:r>
+        <w:rPr>
+          <w:bCs/>
+          <w:b/>
+        </w:rPr>
+        <w:t xml:space="preserve">The Sprint 5 review, as done.</w:t>
+      </w:r>
+      <w:r>
+        <w:t xml:space="preserve"> </w:t>
+      </w:r>
+      <w:r>
+        <w:t xml:space="preserve">Sui Lung reviewed the five reference-run groups on 26 September (</w:t>
+      </w:r>
+      <w:r>
+        <w:rPr>
+          <w:rStyle w:val="VerbatimChar"/>
+        </w:rPr>
+        <w:t xml:space="preserve">docs/cluster-review-sprint5.md</w:t>
+      </w:r>
+      <w:r>
+        <w:t xml:space="preserve">, landed 2 October under IOLG-133): four Agree, one Disagree (Object-Oriented Design and Implementation), and both SILOs the model flagged as vague were agreed vague. The verdicts are kept in a separate file,</w:t>
+      </w:r>
+      <w:r>
+        <w:t xml:space="preserve"> </w:t>
+      </w:r>
+      <w:r>
+        <w:rPr>
+          <w:rStyle w:val="VerbatimChar"/>
+        </w:rPr>
+        <w:t xml:space="preserve">data-fixtures/reference-run/silo_clustering.review.sui-lung.json</w:t>
+      </w:r>
+      <w:r>
+        <w:t xml:space="preserve">, so the all-confirmed reference run keeps working offline. That is the pattern to follow: a reviewer’s decisions go in a review file of their own, named for them, and the pipeline is pointed at it with</w:t>
+      </w:r>
+      <w:r>
+        <w:t xml:space="preserve"> </w:t>
+      </w:r>
+      <w:r>
+        <w:rPr>
+          <w:rStyle w:val="VerbatimChar"/>
+        </w:rPr>
+        <w:t xml:space="preserve">--review-file</w:t>
+      </w:r>
+      <w:r>
+        <w:t xml:space="preserve"> </w:t>
+      </w:r>
+      <w:r>
+        <w:t xml:space="preserve">when their verdicts should drive a run. ⚠</w:t>
       </w:r>
       <w:r>
         <w:t xml:space="preserve"> </w:t>
@@ -7815,17 +7947,17 @@
           <w:iCs/>
           <w:i/>
         </w:rPr>
-        <w:t xml:space="preserve">TO FILL: the agreed review procedure and who signs off, once IOLG-124’s outcome is recorded (IOLG-133).</w:t>
+        <w:t xml:space="preserve">TO FILL: who signs off a review before it drives a report for staff, and whether the project owner confirms or overrules at the 4/5 October review.</w:t>
       </w:r>
     </w:p>
     <w:bookmarkEnd w:id="63"/>
-    <w:bookmarkStart w:id="64" w:name="learning-plans-and-study-strategies"/>
+    <w:bookmarkStart w:id="64" w:name="X4f4b51cce8731b0d7d1994fadbe359bfcedca57"/>
     <w:p>
       <w:pPr>
         <w:pStyle w:val="Heading2"/>
       </w:pPr>
       <w:r>
-        <w:t xml:space="preserve">9. Learning plans and study strategies</w:t>
+        <w:t xml:space="preserve">9. Learning plans, study strategies and practice quizzes</w:t>
       </w:r>
     </w:p>
     <w:p>
@@ -7833,7 +7965,20 @@
         <w:pStyle w:val="FirstParagraph"/>
       </w:pPr>
       <w:r>
-        <w:t xml:space="preserve">Both commands call the language model for one student and check every reference in the answer against the data before writing anything. They need a confirmed clustering; pass the cache and review file explicitly when they are not in the default place.</w:t>
+        <w:t xml:space="preserve">All three commands call the language model for one student and check every reference in the answer against the data before writing anything. They need a confirmed clustering; pass the cache and review file explicitly when they are not in the default place. The quiz command is in open pull request #52</w:t>
+      </w:r>
+      <w:r>
+        <w:t xml:space="preserve"> </w:t>
+      </w:r>
+      <w:r>
+        <w:rPr>
+          <w:bCs/>
+          <w:b/>
+        </w:rPr>
+        <w:t xml:space="preserve">(PR #52)</w:t>
+      </w:r>
+      <w:r>
+        <w:t xml:space="preserve">.</w:t>
       </w:r>
     </w:p>
     <w:p>
@@ -8055,6 +8200,111 @@
           <w:rStyle w:val="NormalTok"/>
         </w:rPr>
         <w:t xml:space="preserve">/silo_clustering.review.json</w:t>
+      </w:r>
+      <w:r>
+        <w:br/>
+      </w:r>
+      <w:r>
+        <w:rPr>
+          <w:rStyle w:val="ExtensionTok"/>
+        </w:rPr>
+        <w:t xml:space="preserve">python</w:t>
+      </w:r>
+      <w:r>
+        <w:rPr>
+          <w:rStyle w:val="NormalTok"/>
+        </w:rPr>
+        <w:t xml:space="preserve"> </w:t>
+      </w:r>
+      <w:r>
+        <w:rPr>
+          <w:rStyle w:val="AttributeTok"/>
+        </w:rPr>
+        <w:t xml:space="preserve">-m</w:t>
+      </w:r>
+      <w:r>
+        <w:rPr>
+          <w:rStyle w:val="NormalTok"/>
+        </w:rPr>
+        <w:t xml:space="preserve"> lja.quiz     </w:t>
+      </w:r>
+      <w:r>
+        <w:rPr>
+          <w:rStyle w:val="OperatorTok"/>
+        </w:rPr>
+        <w:t xml:space="preserve">&lt;</w:t>
+      </w:r>
+      <w:r>
+        <w:rPr>
+          <w:rStyle w:val="NormalTok"/>
+        </w:rPr>
+        <w:t xml:space="preserve">workbook.xlsx</w:t>
+      </w:r>
+      <w:r>
+        <w:rPr>
+          <w:rStyle w:val="OperatorTok"/>
+        </w:rPr>
+        <w:t xml:space="preserve">&gt;</w:t>
+      </w:r>
+      <w:r>
+        <w:rPr>
+          <w:rStyle w:val="NormalTok"/>
+        </w:rPr>
+        <w:t xml:space="preserve"> STU0003 </w:t>
+      </w:r>
+      <w:r>
+        <w:rPr>
+          <w:rStyle w:val="AttributeTok"/>
+        </w:rPr>
+        <w:t xml:space="preserve">--clustering-cache</w:t>
+      </w:r>
+      <w:r>
+        <w:rPr>
+          <w:rStyle w:val="NormalTok"/>
+        </w:rPr>
+        <w:t xml:space="preserve"> </w:t>
+      </w:r>
+      <w:r>
+        <w:rPr>
+          <w:rStyle w:val="VariableTok"/>
+        </w:rPr>
+        <w:t xml:space="preserve">$R</w:t>
+      </w:r>
+      <w:r>
+        <w:rPr>
+          <w:rStyle w:val="NormalTok"/>
+        </w:rPr>
+        <w:t xml:space="preserve">/silo_clustering.json </w:t>
+      </w:r>
+      <w:r>
+        <w:rPr>
+          <w:rStyle w:val="AttributeTok"/>
+        </w:rPr>
+        <w:t xml:space="preserve">--review-file</w:t>
+      </w:r>
+      <w:r>
+        <w:rPr>
+          <w:rStyle w:val="NormalTok"/>
+        </w:rPr>
+        <w:t xml:space="preserve"> </w:t>
+      </w:r>
+      <w:r>
+        <w:rPr>
+          <w:rStyle w:val="VariableTok"/>
+        </w:rPr>
+        <w:t xml:space="preserve">$R</w:t>
+      </w:r>
+      <w:r>
+        <w:rPr>
+          <w:rStyle w:val="NormalTok"/>
+        </w:rPr>
+        <w:t xml:space="preserve">/silo_clustering.review.json   </w:t>
+      </w:r>
+      <w:r>
+        <w:rPr>
+          <w:rStyle w:val="CommentTok"/>
+        </w:rPr>
+        <w:t xml:space="preserve"># PR #52</w:t>
       </w:r>
     </w:p>
     <w:tbl>
@@ -8243,6 +8493,84 @@
           </w:p>
         </w:tc>
       </w:tr>
+      <w:tr>
+        <w:tc>
+          <w:tcPr/>
+          <w:p>
+            <w:pPr>
+              <w:pStyle w:val="Compact"/>
+              <w:jc w:val="left"/>
+            </w:pPr>
+            <w:r>
+              <w:rPr>
+                <w:rStyle w:val="VerbatimChar"/>
+              </w:rPr>
+              <w:t xml:space="preserve">lja.quiz</w:t>
+            </w:r>
+            <w:r>
+              <w:t xml:space="preserve"> </w:t>
+            </w:r>
+            <w:r>
+              <w:rPr>
+                <w:bCs/>
+                <w:b/>
+              </w:rPr>
+              <w:t xml:space="preserve">(PR #52)</w:t>
+            </w:r>
+          </w:p>
+        </w:tc>
+        <w:tc>
+          <w:tcPr/>
+          <w:p>
+            <w:pPr>
+              <w:pStyle w:val="Compact"/>
+              <w:jc w:val="left"/>
+            </w:pPr>
+            <w:r>
+              <w:rPr>
+                <w:rStyle w:val="VerbatimChar"/>
+              </w:rPr>
+              <w:t xml:space="preserve">output/quizzes/quiz_&lt;id&gt;.json</w:t>
+            </w:r>
+            <w:r>
+              <w:t xml:space="preserve"> </w:t>
+            </w:r>
+            <w:r>
+              <w:t xml:space="preserve">and</w:t>
+            </w:r>
+            <w:r>
+              <w:t xml:space="preserve"> </w:t>
+            </w:r>
+            <w:r>
+              <w:rPr>
+                <w:rStyle w:val="VerbatimChar"/>
+              </w:rPr>
+              <w:t xml:space="preserve">.md</w:t>
+            </w:r>
+          </w:p>
+        </w:tc>
+        <w:tc>
+          <w:tcPr/>
+          <w:p>
+            <w:pPr>
+              <w:pStyle w:val="Compact"/>
+              <w:jc w:val="left"/>
+            </w:pPr>
+            <w:r>
+              <w:t xml:space="preserve">Two questions per gap competency by default (</w:t>
+            </w:r>
+            <w:r>
+              <w:rPr>
+                <w:rStyle w:val="VerbatimChar"/>
+              </w:rPr>
+              <w:t xml:space="preserve">--items-per-gap</w:t>
+            </w:r>
+            <w:r>
+              <w:t xml:space="preserve">), each tied to one of the student’s SILOs and one of their assessments, with the subject’s handbook synopsis as background. A question is either multiple choice (3 or 4 options and a key) or a written task (a model answer and 2 to 5 marking points). Then a second, blind pass by the model answers each question without seeing the key and writes the explanation a tutor would give; the code compares and marks any disagreement. The dashboard shows the quiz on the student’s page.</w:t>
+            </w:r>
+          </w:p>
+        </w:tc>
+      </w:tr>
     </w:tbl>
     <w:p>
       <w:pPr>
@@ -8327,6 +8655,118 @@
           <w:bCs/>
           <w:b/>
         </w:rPr>
+        <w:t xml:space="preserve">Quiz options (PR #52).</w:t>
+      </w:r>
+      <w:r>
+        <w:t xml:space="preserve"> </w:t>
+      </w:r>
+      <w:r>
+        <w:rPr>
+          <w:rStyle w:val="VerbatimChar"/>
+        </w:rPr>
+        <w:t xml:space="preserve">--format</w:t>
+      </w:r>
+      <w:r>
+        <w:t xml:space="preserve"> </w:t>
+      </w:r>
+      <w:r>
+        <w:t xml:space="preserve">is the educator’s policy:</w:t>
+      </w:r>
+      <w:r>
+        <w:t xml:space="preserve"> </w:t>
+      </w:r>
+      <w:r>
+        <w:rPr>
+          <w:rStyle w:val="VerbatimChar"/>
+        </w:rPr>
+        <w:t xml:space="preserve">multiple_choice</w:t>
+      </w:r>
+      <w:r>
+        <w:t xml:space="preserve">,</w:t>
+      </w:r>
+      <w:r>
+        <w:t xml:space="preserve"> </w:t>
+      </w:r>
+      <w:r>
+        <w:rPr>
+          <w:rStyle w:val="VerbatimChar"/>
+        </w:rPr>
+        <w:t xml:space="preserve">written</w:t>
+      </w:r>
+      <w:r>
+        <w:t xml:space="preserve">, or</w:t>
+      </w:r>
+      <w:r>
+        <w:t xml:space="preserve"> </w:t>
+      </w:r>
+      <w:r>
+        <w:rPr>
+          <w:rStyle w:val="VerbatimChar"/>
+        </w:rPr>
+        <w:t xml:space="preserve">mixed</w:t>
+      </w:r>
+      <w:r>
+        <w:t xml:space="preserve"> </w:t>
+      </w:r>
+      <w:r>
+        <w:t xml:space="preserve">(the default), under which the model chooses per question but an outcome whose wording asks the student to</w:t>
+      </w:r>
+      <w:r>
+        <w:t xml:space="preserve"> </w:t>
+      </w:r>
+      <w:r>
+        <w:rPr>
+          <w:iCs/>
+          <w:i/>
+        </w:rPr>
+        <w:t xml:space="preserve">do</w:t>
+      </w:r>
+      <w:r>
+        <w:t xml:space="preserve"> </w:t>
+      </w:r>
+      <w:r>
+        <w:t xml:space="preserve">something (implement, design, analyse, explain, …) must get a written task. Written tasks are the better learning instrument where the outcome asks for doing; multiple choice is the only kind that marks itself.</w:t>
+      </w:r>
+      <w:r>
+        <w:t xml:space="preserve"> </w:t>
+      </w:r>
+      <w:r>
+        <w:rPr>
+          <w:rStyle w:val="VerbatimChar"/>
+        </w:rPr>
+        <w:t xml:space="preserve">--catalogue</w:t>
+      </w:r>
+      <w:r>
+        <w:t xml:space="preserve"> </w:t>
+      </w:r>
+      <w:r>
+        <w:t xml:space="preserve">names the subject catalogue for titles and synopses (skipped if the file is missing; the quiz then shows codes only).</w:t>
+      </w:r>
+      <w:r>
+        <w:t xml:space="preserve"> </w:t>
+      </w:r>
+      <w:r>
+        <w:rPr>
+          <w:rStyle w:val="VerbatimChar"/>
+        </w:rPr>
+        <w:t xml:space="preserve">--skip-educator-review</w:t>
+      </w:r>
+      <w:r>
+        <w:t xml:space="preserve"> </w:t>
+      </w:r>
+      <w:r>
+        <w:t xml:space="preserve">leaves out the blind second pass.</w:t>
+      </w:r>
+    </w:p>
+    <w:p>
+      <w:pPr>
+        <w:pStyle w:val="BodyText"/>
+      </w:pPr>
+      <w:r>
+        <w:rPr>
+          <w:bCs/>
+          <w:b/>
+        </w:rPr>
         <w:t xml:space="preserve">Exit codes.</w:t>
       </w:r>
       <w:r>
@@ -8354,6 +8794,21 @@
         <w:t xml:space="preserve">strategy</w:t>
       </w:r>
       <w:r>
+        <w:t xml:space="preserve"> </w:t>
+      </w:r>
+      <w:r>
+        <w:t xml:space="preserve">and</w:t>
+      </w:r>
+      <w:r>
+        <w:t xml:space="preserve"> </w:t>
+      </w:r>
+      <w:r>
+        <w:rPr>
+          <w:rStyle w:val="VerbatimChar"/>
+        </w:rPr>
+        <w:t xml:space="preserve">quiz</w:t>
+      </w:r>
+      <w:r>
         <w:t xml:space="preserve">, the student has no gap so nothing was generated.</w:t>
       </w:r>
       <w:r>
@@ -8392,7 +8847,7 @@
         <w:pStyle w:val="BlockText"/>
       </w:pPr>
       <w:r>
-        <w:t xml:space="preserve">Both are AI-generated documents. The grounding check proves every competency, subject and assessment named exists and belongs to that student. It does not prove the advice is good. Nothing here is student-facing until staff have read it; the dashboard says so above every plan.</w:t>
+        <w:t xml:space="preserve">All three are AI-generated documents. The grounding check proves every competency, subject and assessment named exists and belongs to that student. It does not prove the advice is good, and for a quiz it cannot prove the marked answer is correct: the only subject matter the model is given is the outcome wording, the assessment names, the marker’s feedback and the handbook synopsis, so the question and its answer come from the model’s general knowledge. The blind second pass catches a disagreement, not a shared blind spot (on the first live run the same model agreed confidently with a question a tutor could mark the other way). Nothing here is student-facing until staff have read it; the dashboard says so above every plan and every quiz.</w:t>
       </w:r>
     </w:p>
     <w:bookmarkEnd w:id="64"/>
@@ -8569,28 +9024,7 @@
               <w:jc w:val="left"/>
             </w:pPr>
             <w:r>
-              <w:t xml:space="preserve">one per student: totals, band, gap counts, priority, whether a plan exists (</w:t>
-            </w:r>
-            <w:r>
-              <w:rPr>
-                <w:rStyle w:val="VerbatimChar"/>
-              </w:rPr>
-              <w:t xml:space="preserve">in_plan</w:t>
-            </w:r>
-            <w:r>
-              <w:t xml:space="preserve">, read from</w:t>
-            </w:r>
-            <w:r>
-              <w:t xml:space="preserve"> </w:t>
-            </w:r>
-            <w:r>
-              <w:rPr>
-                <w:rStyle w:val="VerbatimChar"/>
-              </w:rPr>
-              <w:t xml:space="preserve">--plans-dir</w:t>
-            </w:r>
-            <w:r>
-              <w:t xml:space="preserve">)</w:t>
+              <w:t xml:space="preserve">one per student: performance band, average total, then one column per subject with the student’s total (blank where not enrolled)</w:t>
             </w:r>
           </w:p>
         </w:tc>
@@ -8619,7 +9053,31 @@
               <w:jc w:val="left"/>
             </w:pPr>
             <w:r>
-              <w:t xml:space="preserve">one per student × competency, the gap report with the run’s thresholds</w:t>
+              <w:t xml:space="preserve">one per student × competency: the gap report’s columns (attainment, classification, basis, relative position, subjects evidencing, observations) plus the trend across subjects and</w:t>
+            </w:r>
+            <w:r>
+              <w:t xml:space="preserve"> </w:t>
+            </w:r>
+            <w:r>
+              <w:rPr>
+                <w:rStyle w:val="VerbatimChar"/>
+              </w:rPr>
+              <w:t xml:space="preserve">in_plan</w:t>
+            </w:r>
+            <w:r>
+              <w:t xml:space="preserve">, which is true when the student’s learning plan (read from</w:t>
+            </w:r>
+            <w:r>
+              <w:t xml:space="preserve"> </w:t>
+            </w:r>
+            <w:r>
+              <w:rPr>
+                <w:rStyle w:val="VerbatimChar"/>
+              </w:rPr>
+              <w:t xml:space="preserve">--plans-dir</w:t>
+            </w:r>
+            <w:r>
+              <w:t xml:space="preserve">) names this competency as a priority</w:t>
             </w:r>
           </w:p>
         </w:tc>
@@ -8648,7 +9106,7 @@
               <w:jc w:val="left"/>
             </w:pPr>
             <w:r>
-              <w:t xml:space="preserve">the cohort statistics</w:t>
+              <w:t xml:space="preserve">one per competency, aggregated over the cohort: gap rate and proficient rate, with no student ids</w:t>
             </w:r>
           </w:p>
         </w:tc>
@@ -10038,7 +10496,112 @@
         <w:pStyle w:val="BodyText"/>
       </w:pPr>
       <w:r>
-        <w:t xml:space="preserve">⚠</w:t>
+        <w:t xml:space="preserve">The six security checks (role created, update refused, fixture readable, database unchanged by a run, web-service token scope, scanner results) were all observed on the development instance on 28 September; none has been run on a shared instance yet.</w:t>
+      </w:r>
+    </w:p>
+    <w:p>
+      <w:pPr>
+        <w:pStyle w:val="BodyText"/>
+      </w:pPr>
+      <w:r>
+        <w:rPr>
+          <w:bCs/>
+          <w:b/>
+        </w:rPr>
+        <w:t xml:space="preserve">The dashboard reads Excel only.</w:t>
+      </w:r>
+      <w:r>
+        <w:t xml:space="preserve"> </w:t>
+      </w:r>
+      <w:r>
+        <w:rPr>
+          <w:rStyle w:val="VerbatimChar"/>
+        </w:rPr>
+        <w:t xml:space="preserve">python -m lja.dashboard</w:t>
+      </w:r>
+      <w:r>
+        <w:t xml:space="preserve"> </w:t>
+      </w:r>
+      <w:r>
+        <w:t xml:space="preserve">has</w:t>
+      </w:r>
+      <w:r>
+        <w:t xml:space="preserve"> </w:t>
+      </w:r>
+      <w:r>
+        <w:rPr>
+          <w:rStyle w:val="VerbatimChar"/>
+        </w:rPr>
+        <w:t xml:space="preserve">--excel-path</w:t>
+      </w:r>
+      <w:r>
+        <w:t xml:space="preserve"> </w:t>
+      </w:r>
+      <w:r>
+        <w:t xml:space="preserve">and no</w:t>
+      </w:r>
+      <w:r>
+        <w:t xml:space="preserve"> </w:t>
+      </w:r>
+      <w:r>
+        <w:rPr>
+          <w:rStyle w:val="VerbatimChar"/>
+        </w:rPr>
+        <w:t xml:space="preserve">--source</w:t>
+      </w:r>
+      <w:r>
+        <w:t xml:space="preserve"> </w:t>
+      </w:r>
+      <w:r>
+        <w:t xml:space="preserve">option, and there is no command that writes a Moodle run back out as a workbook. So a Moodle-sourced run can be analysed (</w:t>
+      </w:r>
+      <w:r>
+        <w:rPr>
+          <w:rStyle w:val="VerbatimChar"/>
+        </w:rPr>
+        <w:t xml:space="preserve">lja.cli</w:t>
+      </w:r>
+      <w:r>
+        <w:t xml:space="preserve">,</w:t>
+      </w:r>
+      <w:r>
+        <w:t xml:space="preserve"> </w:t>
+      </w:r>
+      <w:r>
+        <w:rPr>
+          <w:rStyle w:val="VerbatimChar"/>
+        </w:rPr>
+        <w:t xml:space="preserve">lja.plan</w:t>
+      </w:r>
+      <w:r>
+        <w:t xml:space="preserve">,</w:t>
+      </w:r>
+      <w:r>
+        <w:t xml:space="preserve"> </w:t>
+      </w:r>
+      <w:r>
+        <w:rPr>
+          <w:rStyle w:val="VerbatimChar"/>
+        </w:rPr>
+        <w:t xml:space="preserve">lja.export</w:t>
+      </w:r>
+      <w:r>
+        <w:t xml:space="preserve"> </w:t>
+      </w:r>
+      <w:r>
+        <w:t xml:space="preserve">all take</w:t>
+      </w:r>
+      <w:r>
+        <w:t xml:space="preserve"> </w:t>
+      </w:r>
+      <w:r>
+        <w:rPr>
+          <w:rStyle w:val="VerbatimChar"/>
+        </w:rPr>
+        <w:t xml:space="preserve">--source moodle</w:t>
+      </w:r>
+      <w:r>
+        <w:t xml:space="preserve">) but not yet browsed. ⚠</w:t>
       </w:r>
       <w:r>
         <w:t xml:space="preserve"> </w:t>
@@ -10070,23 +10633,7 @@
           <w:iCs/>
           <w:i/>
         </w:rPr>
-        <w:t xml:space="preserve">, which host, how the criterion map is maintained per subject), once the shared-instance step in IOLG-111 is done. The dashboard itself reads Excel only; a Moodle run is exported to a workbook shape first.</w:t>
-      </w:r>
-      <w:r>
-        <w:t xml:space="preserve"> </w:t>
-      </w:r>
-      <w:r>
-        <w:t xml:space="preserve">⚠</w:t>
-      </w:r>
-      <w:r>
-        <w:t xml:space="preserve"> </w:t>
-      </w:r>
-      <w:r>
-        <w:rPr>
-          <w:iCs/>
-          <w:i/>
-        </w:rPr>
-        <w:t xml:space="preserve">TO CONFIRM: whether that export step exists as a command or is a manual step.</w:t>
+        <w:t xml:space="preserve">, which host, how the criterion map is maintained per subject), once the shared-instance step in IOLG-111 is done.</w:t>
       </w:r>
     </w:p>
     <w:p>
@@ -10153,7 +10700,22 @@
         <w:pStyle w:val="BodyText"/>
       </w:pPr>
       <w:r>
-        <w:t xml:space="preserve">Pages marked</w:t>
+        <w:t xml:space="preserve">Everything in this part is on</w:t>
+      </w:r>
+      <w:r>
+        <w:t xml:space="preserve"> </w:t>
+      </w:r>
+      <w:r>
+        <w:rPr>
+          <w:rStyle w:val="VerbatimChar"/>
+        </w:rPr>
+        <w:t xml:space="preserve">main</w:t>
+      </w:r>
+      <w:r>
+        <w:t xml:space="preserve"> </w:t>
+      </w:r>
+      <w:r>
+        <w:t xml:space="preserve">except the practice quiz section of the student page, which is in open pull request #52 and marked</w:t>
       </w:r>
       <w:r>
         <w:t xml:space="preserve"> </w:t>
@@ -10163,13 +10725,116 @@
           <w:bCs/>
           <w:b/>
         </w:rPr>
-        <w:t xml:space="preserve">(PR #43)</w:t>
-      </w:r>
-      <w:r>
-        <w:t xml:space="preserve"> </w:t>
-      </w:r>
-      <w:r>
-        <w:t xml:space="preserve">are on the IOLG-134 branch, open for review at the time of writing, and are not yet on</w:t>
+        <w:t xml:space="preserve">(PR #52)</w:t>
+      </w:r>
+      <w:r>
+        <w:t xml:space="preserve">.</w:t>
+      </w:r>
+    </w:p>
+    <w:bookmarkStart w:id="72" w:name="starting-it-and-finding-your-way"/>
+    <w:p>
+      <w:pPr>
+        <w:pStyle w:val="Heading2"/>
+      </w:pPr>
+      <w:r>
+        <w:t xml:space="preserve">13. Starting it and finding your way</w:t>
+      </w:r>
+    </w:p>
+    <w:p>
+      <w:pPr>
+        <w:pStyle w:val="SourceCode"/>
+      </w:pPr>
+      <w:r>
+        <w:rPr>
+          <w:rStyle w:val="ExtensionTok"/>
+        </w:rPr>
+        <w:t xml:space="preserve">python</w:t>
+      </w:r>
+      <w:r>
+        <w:rPr>
+          <w:rStyle w:val="NormalTok"/>
+        </w:rPr>
+        <w:t xml:space="preserve"> </w:t>
+      </w:r>
+      <w:r>
+        <w:rPr>
+          <w:rStyle w:val="AttributeTok"/>
+        </w:rPr>
+        <w:t xml:space="preserve">-m</w:t>
+      </w:r>
+      <w:r>
+        <w:rPr>
+          <w:rStyle w:val="NormalTok"/>
+        </w:rPr>
+        <w:t xml:space="preserve"> lja.dashboard </w:t>
+      </w:r>
+      <w:r>
+        <w:rPr>
+          <w:rStyle w:val="AttributeTok"/>
+        </w:rPr>
+        <w:t xml:space="preserve">--excel-path</w:t>
+      </w:r>
+      <w:r>
+        <w:rPr>
+          <w:rStyle w:val="NormalTok"/>
+        </w:rPr>
+        <w:t xml:space="preserve"> </w:t>
+      </w:r>
+      <w:r>
+        <w:rPr>
+          <w:rStyle w:val="OperatorTok"/>
+        </w:rPr>
+        <w:t xml:space="preserve">&lt;</w:t>
+      </w:r>
+      <w:r>
+        <w:rPr>
+          <w:rStyle w:val="NormalTok"/>
+        </w:rPr>
+        <w:t xml:space="preserve">workbook.xlsx</w:t>
+      </w:r>
+      <w:r>
+        <w:rPr>
+          <w:rStyle w:val="OperatorTok"/>
+        </w:rPr>
+        <w:t xml:space="preserve">&gt;</w:t>
+      </w:r>
+      <w:r>
+        <w:rPr>
+          <w:rStyle w:val="NormalTok"/>
+        </w:rPr>
+        <w:t xml:space="preserve"> --clustering-cache </w:t>
+      </w:r>
+      <w:r>
+        <w:rPr>
+          <w:rStyle w:val="OperatorTok"/>
+        </w:rPr>
+        <w:t xml:space="preserve">&lt;</w:t>
+      </w:r>
+      <w:r>
+        <w:rPr>
+          <w:rStyle w:val="NormalTok"/>
+        </w:rPr>
+        <w:t xml:space="preserve">cache.json</w:t>
+      </w:r>
+      <w:r>
+        <w:rPr>
+          <w:rStyle w:val="OperatorTok"/>
+        </w:rPr>
+        <w:t xml:space="preserve">&gt;</w:t>
+      </w:r>
+      <w:r>
+        <w:rPr>
+          <w:rStyle w:val="NormalTok"/>
+        </w:rPr>
+        <w:t xml:space="preserve"> [--port 8000] [--host 127.0.0.1]</w:t>
+      </w:r>
+    </w:p>
+    <w:p>
+      <w:pPr>
+        <w:pStyle w:val="FirstParagraph"/>
+      </w:pPr>
+      <w:r>
+        <w:t xml:space="preserve">With no flags it opens the workbook and cache named in</w:t>
       </w:r>
       <w:r>
         <w:t xml:space="preserve"> </w:t>
@@ -10178,140 +10843,34 @@
         <w:rPr>
           <w:rStyle w:val="VerbatimChar"/>
         </w:rPr>
-        <w:t xml:space="preserve">main</w:t>
-      </w:r>
-      <w:r>
-        <w:t xml:space="preserve">.</w:t>
-      </w:r>
-    </w:p>
-    <w:bookmarkStart w:id="72" w:name="starting-it-and-finding-your-way"/>
-    <w:p>
-      <w:pPr>
-        <w:pStyle w:val="Heading2"/>
-      </w:pPr>
-      <w:r>
-        <w:t xml:space="preserve">13. Starting it and finding your way</w:t>
-      </w:r>
-    </w:p>
-    <w:p>
-      <w:pPr>
-        <w:pStyle w:val="SourceCode"/>
-      </w:pPr>
-      <w:r>
-        <w:rPr>
-          <w:rStyle w:val="ExtensionTok"/>
-        </w:rPr>
-        <w:t xml:space="preserve">python</w:t>
-      </w:r>
-      <w:r>
-        <w:rPr>
-          <w:rStyle w:val="NormalTok"/>
-        </w:rPr>
-        <w:t xml:space="preserve"> </w:t>
-      </w:r>
-      <w:r>
-        <w:rPr>
-          <w:rStyle w:val="AttributeTok"/>
-        </w:rPr>
-        <w:t xml:space="preserve">-m</w:t>
-      </w:r>
-      <w:r>
-        <w:rPr>
-          <w:rStyle w:val="NormalTok"/>
-        </w:rPr>
-        <w:t xml:space="preserve"> lja.dashboard </w:t>
-      </w:r>
-      <w:r>
-        <w:rPr>
-          <w:rStyle w:val="AttributeTok"/>
-        </w:rPr>
-        <w:t xml:space="preserve">--excel-path</w:t>
-      </w:r>
-      <w:r>
-        <w:rPr>
-          <w:rStyle w:val="NormalTok"/>
-        </w:rPr>
-        <w:t xml:space="preserve"> </w:t>
-      </w:r>
-      <w:r>
-        <w:rPr>
-          <w:rStyle w:val="OperatorTok"/>
-        </w:rPr>
-        <w:t xml:space="preserve">&lt;</w:t>
-      </w:r>
-      <w:r>
-        <w:rPr>
-          <w:rStyle w:val="NormalTok"/>
-        </w:rPr>
-        <w:t xml:space="preserve">workbook.xlsx</w:t>
-      </w:r>
-      <w:r>
-        <w:rPr>
-          <w:rStyle w:val="OperatorTok"/>
-        </w:rPr>
-        <w:t xml:space="preserve">&gt;</w:t>
-      </w:r>
-      <w:r>
-        <w:rPr>
-          <w:rStyle w:val="NormalTok"/>
-        </w:rPr>
-        <w:t xml:space="preserve"> --clustering-cache </w:t>
-      </w:r>
-      <w:r>
-        <w:rPr>
-          <w:rStyle w:val="OperatorTok"/>
-        </w:rPr>
-        <w:t xml:space="preserve">&lt;</w:t>
-      </w:r>
-      <w:r>
-        <w:rPr>
-          <w:rStyle w:val="NormalTok"/>
-        </w:rPr>
-        <w:t xml:space="preserve">cache.json</w:t>
-      </w:r>
-      <w:r>
-        <w:rPr>
-          <w:rStyle w:val="OperatorTok"/>
-        </w:rPr>
-        <w:t xml:space="preserve">&gt;</w:t>
-      </w:r>
-      <w:r>
-        <w:rPr>
-          <w:rStyle w:val="NormalTok"/>
-        </w:rPr>
-        <w:t xml:space="preserve"> [--port 8000] [--host 127.0.0.1]</w:t>
-      </w:r>
-    </w:p>
-    <w:p>
-      <w:pPr>
-        <w:pStyle w:val="FirstParagraph"/>
-      </w:pPr>
-      <w:r>
-        <w:t xml:space="preserve">With no flags it opens the workbook and cache named in</w:t>
-      </w:r>
-      <w:r>
-        <w:t xml:space="preserve"> </w:t>
+        <w:t xml:space="preserve">.env</w:t>
+      </w:r>
+      <w:r>
+        <w:t xml:space="preserve"> </w:t>
+      </w:r>
+      <w:r>
+        <w:t xml:space="preserve">(</w:t>
       </w:r>
       <w:r>
         <w:rPr>
           <w:rStyle w:val="VerbatimChar"/>
         </w:rPr>
-        <w:t xml:space="preserve">.env</w:t>
-      </w:r>
-      <w:r>
-        <w:t xml:space="preserve"> </w:t>
-      </w:r>
-      <w:r>
-        <w:t xml:space="preserve">(</w:t>
+        <w:t xml:space="preserve">LJA_DASHBOARD_EXCEL_PATH</w:t>
+      </w:r>
+      <w:r>
+        <w:t xml:space="preserve">,</w:t>
+      </w:r>
+      <w:r>
+        <w:t xml:space="preserve"> </w:t>
       </w:r>
       <w:r>
         <w:rPr>
           <w:rStyle w:val="VerbatimChar"/>
         </w:rPr>
-        <w:t xml:space="preserve">LJA_DASHBOARD_EXCEL_PATH</w:t>
-      </w:r>
-      <w:r>
-        <w:t xml:space="preserve">,</w:t>
+        <w:t xml:space="preserve">LJA_DASHBOARD_CLUSTERING_CACHE</w:t>
+      </w:r>
+      <w:r>
+        <w:t xml:space="preserve">). The review file is always</w:t>
       </w:r>
       <w:r>
         <w:t xml:space="preserve"> </w:t>
@@ -10320,10 +10879,13 @@
         <w:rPr>
           <w:rStyle w:val="VerbatimChar"/>
         </w:rPr>
-        <w:t xml:space="preserve">LJA_DASHBOARD_CLUSTERING_CACHE</w:t>
-      </w:r>
-      <w:r>
-        <w:t xml:space="preserve">). The review file is always</w:t>
+        <w:t xml:space="preserve">&lt;cache&gt;.review.json</w:t>
+      </w:r>
+      <w:r>
+        <w:t xml:space="preserve"> </w:t>
+      </w:r>
+      <w:r>
+        <w:t xml:space="preserve">beside the cache; if it is missing every group counts as pending and the warning banner shows. Learning plans are read from</w:t>
       </w:r>
       <w:r>
         <w:t xml:space="preserve"> </w:t>
@@ -10332,13 +10894,13 @@
         <w:rPr>
           <w:rStyle w:val="VerbatimChar"/>
         </w:rPr>
-        <w:t xml:space="preserve">&lt;cache&gt;.review.json</w:t>
-      </w:r>
-      <w:r>
-        <w:t xml:space="preserve"> </w:t>
-      </w:r>
-      <w:r>
-        <w:t xml:space="preserve">beside the cache; if it is missing every group counts as pending and the warning banner shows. Learning plans are read from</w:t>
+        <w:t xml:space="preserve">LJA_DASHBOARD_PLANS_DIR</w:t>
+      </w:r>
+      <w:r>
+        <w:t xml:space="preserve"> </w:t>
+      </w:r>
+      <w:r>
+        <w:t xml:space="preserve">(default</w:t>
       </w:r>
       <w:r>
         <w:t xml:space="preserve"> </w:t>
@@ -10347,7 +10909,19 @@
         <w:rPr>
           <w:rStyle w:val="VerbatimChar"/>
         </w:rPr>
-        <w:t xml:space="preserve">LJA_DASHBOARD_PLANS_DIR</w:t>
+        <w:t xml:space="preserve">output/plans</w:t>
+      </w:r>
+      <w:r>
+        <w:t xml:space="preserve">) and, with PR #52, practice quizzes from</w:t>
+      </w:r>
+      <w:r>
+        <w:t xml:space="preserve"> </w:t>
+      </w:r>
+      <w:r>
+        <w:rPr>
+          <w:rStyle w:val="VerbatimChar"/>
+        </w:rPr>
+        <w:t xml:space="preserve">LJA_DASHBOARD_QUIZZES_DIR</w:t>
       </w:r>
       <w:r>
         <w:t xml:space="preserve"> </w:t>
@@ -10362,7 +10936,7 @@
         <w:rPr>
           <w:rStyle w:val="VerbatimChar"/>
         </w:rPr>
-        <w:t xml:space="preserve">output/plans</w:t>
+        <w:t xml:space="preserve">output/quizzes</w:t>
       </w:r>
       <w:r>
         <w:t xml:space="preserve">). Only</w:t>
@@ -10544,7 +11118,7 @@
           <w:bCs/>
           <w:b/>
         </w:rPr>
-        <w:t xml:space="preserve">Controls you will meet everywhere (PR #43):</w:t>
+        <w:t xml:space="preserve">Controls you will meet everywhere:</w:t>
       </w:r>
     </w:p>
     <w:p>
@@ -10894,23 +11468,7 @@
         <w:t xml:space="preserve"> </w:t>
       </w:r>
       <w:r>
-        <w:t xml:space="preserve">open the matching cohort pages. Below them</w:t>
-      </w:r>
-      <w:r>
-        <w:t xml:space="preserve"> </w:t>
-      </w:r>
-      <w:r>
-        <w:rPr>
-          <w:bCs/>
-          <w:b/>
-        </w:rPr>
-        <w:t xml:space="preserve">(PR #43)</w:t>
-      </w:r>
-      <w:r>
-        <w:t xml:space="preserve"> </w:t>
-      </w:r>
-      <w:r>
-        <w:t xml:space="preserve">the three priority tiles in red, amber and blue: 1st priority below the 50% floor, 2nd priority persistent gap relative only, 3rd priority isolated gaps only. Their definitions are Part A §3. The counts, plus the unflagged remainder, sum to the cohort.</w:t>
+        <w:t xml:space="preserve">open the matching cohort pages. Below them the three priority tiles in red, amber and blue: 1st priority below the 50% floor, 2nd priority persistent gap relative only, 3rd priority isolated gaps only. Their definitions are Part A §3. The counts, plus the unflagged remainder, sum to the cohort.</w:t>
       </w:r>
     </w:p>
     <w:p>
@@ -10992,7 +11550,7 @@
           <w:bCs/>
           <w:b/>
         </w:rPr>
-        <w:t xml:space="preserve">Where each flagged student sits (PR #43).</w:t>
+        <w:t xml:space="preserve">Where each flagged student sits.</w:t>
       </w:r>
       <w:r>
         <w:t xml:space="preserve"> </w:t>
@@ -11014,7 +11572,7 @@
           <w:bCs/>
           <w:b/>
         </w:rPr>
-        <w:t xml:space="preserve">Students by priority (PR #43).</w:t>
+        <w:t xml:space="preserve">Students by priority.</w:t>
       </w:r>
       <w:r>
         <w:t xml:space="preserve"> </w:t>
@@ -11254,16 +11812,6 @@
         <w:t xml:space="preserve">priority-3</w:t>
       </w:r>
       <w:r>
-        <w:t xml:space="preserve"> </w:t>
-      </w:r>
-      <w:r>
-        <w:rPr>
-          <w:bCs/>
-          <w:b/>
-        </w:rPr>
-        <w:t xml:space="preserve">(PR #43 for the last three)</w:t>
-      </w:r>
-      <w:r>
         <w:t xml:space="preserve">. The page opens by stating the rule that put its students there, with the live threshold values, so a screenshot of it is self-explaining. There is deliberately no</w:t>
       </w:r>
       <w:r>
@@ -11487,6 +12035,109 @@
           <w:bCs/>
           <w:b/>
         </w:rPr>
+        <w:t xml:space="preserve">Practice quiz (PR #52).</w:t>
+      </w:r>
+      <w:r>
+        <w:t xml:space="preserve"> </w:t>
+      </w:r>
+      <w:r>
+        <w:t xml:space="preserve">If</w:t>
+      </w:r>
+      <w:r>
+        <w:t xml:space="preserve"> </w:t>
+      </w:r>
+      <w:r>
+        <w:rPr>
+          <w:rStyle w:val="VerbatimChar"/>
+        </w:rPr>
+        <w:t xml:space="preserve">lja.quiz</w:t>
+      </w:r>
+      <w:r>
+        <w:t xml:space="preserve"> </w:t>
+      </w:r>
+      <w:r>
+        <w:t xml:space="preserve">has written one for this student (§9): an introduction, the subjects involved with their handbook synopses, then one question per card grouped by gap competency, each labelled with the outcome and assessment it practises. A multiple-choice question has a</w:t>
+      </w:r>
+      <w:r>
+        <w:t xml:space="preserve"> </w:t>
+      </w:r>
+      <w:r>
+        <w:t xml:space="preserve">“</w:t>
+      </w:r>
+      <w:r>
+        <w:t xml:space="preserve">Show answer</w:t>
+      </w:r>
+      <w:r>
+        <w:t xml:space="preserve">”</w:t>
+      </w:r>
+      <w:r>
+        <w:t xml:space="preserve"> </w:t>
+      </w:r>
+      <w:r>
+        <w:t xml:space="preserve">control; a written task has</w:t>
+      </w:r>
+      <w:r>
+        <w:t xml:space="preserve"> </w:t>
+      </w:r>
+      <w:r>
+        <w:t xml:space="preserve">“</w:t>
+      </w:r>
+      <w:r>
+        <w:t xml:space="preserve">Show model answer</w:t>
+      </w:r>
+      <w:r>
+        <w:t xml:space="preserve">”</w:t>
+      </w:r>
+      <w:r>
+        <w:t xml:space="preserve">, which reveals the model answer and the marking points. Under each question a collapsed block,</w:t>
+      </w:r>
+      <w:r>
+        <w:t xml:space="preserve"> </w:t>
+      </w:r>
+      <w:r>
+        <w:t xml:space="preserve">“</w:t>
+      </w:r>
+      <w:r>
+        <w:t xml:space="preserve">For educator view only</w:t>
+      </w:r>
+      <w:r>
+        <w:t xml:space="preserve">”</w:t>
+      </w:r>
+      <w:r>
+        <w:t xml:space="preserve">, holds the blind second pass: whether it agreed with the key (or, for a written task, whether the model answer meets its own marking points), its confidence, the explanation a tutor would give, and any concern it raised. A summary line names any question where the two passes disagreed; that is the one to check first. The page states that the answers have not been verified against course material and asks for staff review before a student uses the quiz.</w:t>
+      </w:r>
+      <w:r>
+        <w:t xml:space="preserve"> </w:t>
+      </w:r>
+      <w:r>
+        <w:t xml:space="preserve">“</w:t>
+      </w:r>
+      <w:r>
+        <w:t xml:space="preserve">For educator view only</w:t>
+      </w:r>
+      <w:r>
+        <w:t xml:space="preserve">”</w:t>
+      </w:r>
+      <w:r>
+        <w:t xml:space="preserve"> </w:t>
+      </w:r>
+      <w:r>
+        <w:t xml:space="preserve">is a label, not a login: anyone who can open the page can expand it.</w:t>
+      </w:r>
+    </w:p>
+    <w:p>
+      <w:pPr>
+        <w:pStyle w:val="Compact"/>
+        <w:numPr>
+          <w:ilvl w:val="0"/>
+          <w:numId w:val="1011"/>
+        </w:numPr>
+      </w:pPr>
+      <w:r>
+        <w:rPr>
+          <w:bCs/>
+          <w:b/>
+        </w:rPr>
         <w:t xml:space="preserve">Competency gaps.</w:t>
       </w:r>
       <w:r>
@@ -11911,7 +12562,7 @@
           <w:iCs/>
           <w:i/>
         </w:rPr>
-        <w:t xml:space="preserve">Figure 10: One of the five outcome lists (PR #43). The sentence under the title states the filter; the charts are drawn from exactly the rows in the table.</w:t>
+        <w:t xml:space="preserve">Figure 10: One of the five outcome lists. The sentence under the title states the filter; the charts are drawn from exactly the rows in the table.</w:t>
       </w:r>
     </w:p>
     <w:p>
@@ -12072,7 +12723,7 @@
           <w:iCs/>
           <w:i/>
         </w:rPr>
-        <w:t xml:space="preserve">Figure 11: The Competencies page (PR #43): every group, how it spreads across disciplines, and how each group’s students are classified.</w:t>
+        <w:t xml:space="preserve">Figure 11: The Competencies page: every group, how it spreads across disciplines, and how each group’s students are classified.</w:t>
       </w:r>
     </w:p>
     <w:p>
@@ -12147,20 +12798,7 @@
         <w:pStyle w:val="BodyText"/>
       </w:pPr>
       <w:r>
-        <w:t xml:space="preserve">A competency’s page opens with its trace</w:t>
-      </w:r>
-      <w:r>
-        <w:t xml:space="preserve"> </w:t>
-      </w:r>
-      <w:r>
-        <w:rPr>
-          <w:bCs/>
-          <w:b/>
-        </w:rPr>
-        <w:t xml:space="preserve">(PR #43)</w:t>
-      </w:r>
-      <w:r>
-        <w:t xml:space="preserve">: the competency, the subjects whose outcomes were grouped into it, those outcomes (hover for the wording; a red outline means the model flagged it, amber means vague wording), and under it every path listed with the assessments that evidence each outcome. That chain, from a student’s mark to their classification, is the answer to</w:t>
+        <w:t xml:space="preserve">A competency’s page opens with its trace: the competency, the subjects whose outcomes were grouped into it, those outcomes (hover for the wording; a red outline means the model flagged it, amber means vague wording), and under it every path listed with the assessments that evidence each outcome. That chain, from a student’s mark to their classification, is the answer to</w:t>
       </w:r>
       <w:r>
         <w:t xml:space="preserve"> </w:t>
@@ -12179,13 +12817,13 @@
       </w:r>
     </w:p>
     <w:bookmarkEnd w:id="98"/>
-    <w:bookmarkStart w:id="108" w:name="subjects-a-subject-and-assessments-pr-43"/>
+    <w:bookmarkStart w:id="108" w:name="subjects-a-subject-and-assessments"/>
     <w:p>
       <w:pPr>
         <w:pStyle w:val="Heading2"/>
       </w:pPr>
       <w:r>
-        <w:t xml:space="preserve">19. Subjects, a subject, and assessments (PR #43)</w:t>
+        <w:t xml:space="preserve">19. Subjects, a subject, and assessments</w:t>
       </w:r>
     </w:p>
     <w:p>
@@ -12440,7 +13078,7 @@
       </w:r>
     </w:p>
     <w:bookmarkEnd w:id="108"/>
-    <w:bookmarkStart w:id="112" w:name="this-run-run-pr-43"/>
+    <w:bookmarkStart w:id="112" w:name="this-run-run"/>
     <w:p>
       <w:pPr>
         <w:pStyle w:val="Heading2"/>
@@ -12455,7 +13093,7 @@
         <w:t xml:space="preserve">/run</w:t>
       </w:r>
       <w:r>
-        <w:t xml:space="preserve">) (PR #43)</w:t>
+        <w:t xml:space="preserve">)</w:t>
       </w:r>
     </w:p>
     <w:p>
@@ -12526,7 +13164,7 @@
       </w:r>
     </w:p>
     <w:bookmarkEnd w:id="112"/>
-    <w:bookmarkStart w:id="116" w:name="glossary-glossary-pr-43"/>
+    <w:bookmarkStart w:id="116" w:name="glossary-glossary"/>
     <w:p>
       <w:pPr>
         <w:pStyle w:val="Heading2"/>
@@ -12541,7 +13179,7 @@
         <w:t xml:space="preserve">/glossary</w:t>
       </w:r>
       <w:r>
-        <w:t xml:space="preserve">) (PR #43)</w:t>
+        <w:t xml:space="preserve">)</w:t>
       </w:r>
     </w:p>
     <w:p>
@@ -12827,17 +13465,37 @@
               <w:jc w:val="left"/>
             </w:pPr>
             <w:r>
-              <w:t xml:space="preserve">The competency’s page, then the Students table filtered by that competency’s name ⚠</w:t>
+              <w:t xml:space="preserve">Not possible on one page yet: the Students table’s gap columns are counts, so its filter cannot match a competency name, and the competency’s page shows classification counts rather than a student list. Use</w:t>
             </w:r>
             <w:r>
               <w:t xml:space="preserve"> </w:t>
             </w:r>
             <w:r>
               <w:rPr>
-                <w:iCs/>
-                <w:i/>
-              </w:rPr>
-              <w:t xml:space="preserve">TO CONFIRM: the table filter matches competency names in the gap columns</w:t>
+                <w:rStyle w:val="VerbatimChar"/>
+              </w:rPr>
+              <w:t xml:space="preserve">python -m lja.export</w:t>
+            </w:r>
+            <w:r>
+              <w:t xml:space="preserve"> </w:t>
+            </w:r>
+            <w:r>
+              <w:t xml:space="preserve">(§10) and filter</w:t>
+            </w:r>
+            <w:r>
+              <w:t xml:space="preserve"> </w:t>
+            </w:r>
+            <w:r>
+              <w:rPr>
+                <w:rStyle w:val="VerbatimChar"/>
+              </w:rPr>
+              <w:t xml:space="preserve">competencies.csv</w:t>
+            </w:r>
+            <w:r>
+              <w:t xml:space="preserve"> </w:t>
+            </w:r>
+            <w:r>
+              <w:t xml:space="preserve">on the competency label and classification. A per-competency student list is a dashboard follow-up.</w:t>
             </w:r>
           </w:p>
         </w:tc>
@@ -13005,6 +13663,117 @@
         </w:numPr>
       </w:pPr>
       <w:r>
+        <w:t xml:space="preserve">The AI review warning says how many groups were rejected but not which (finding UAT-02, 28 September). The pipeline names the rejected group when it stops; the banner does not yet.</w:t>
+      </w:r>
+    </w:p>
+    <w:p>
+      <w:pPr>
+        <w:pStyle w:val="Compact"/>
+        <w:numPr>
+          <w:ilvl w:val="0"/>
+          <w:numId w:val="1013"/>
+        </w:numPr>
+      </w:pPr>
+      <w:r>
+        <w:t xml:space="preserve">After the quick start in §5.3, the bare</w:t>
+      </w:r>
+      <w:r>
+        <w:t xml:space="preserve"> </w:t>
+      </w:r>
+      <w:r>
+        <w:rPr>
+          <w:rStyle w:val="VerbatimChar"/>
+        </w:rPr>
+        <w:t xml:space="preserve">lja.plan</w:t>
+      </w:r>
+      <w:r>
+        <w:t xml:space="preserve">,</w:t>
+      </w:r>
+      <w:r>
+        <w:t xml:space="preserve"> </w:t>
+      </w:r>
+      <w:r>
+        <w:rPr>
+          <w:rStyle w:val="VerbatimChar"/>
+        </w:rPr>
+        <w:t xml:space="preserve">lja.strategy</w:t>
+      </w:r>
+      <w:r>
+        <w:t xml:space="preserve"> </w:t>
+      </w:r>
+      <w:r>
+        <w:t xml:space="preserve">and</w:t>
+      </w:r>
+      <w:r>
+        <w:t xml:space="preserve"> </w:t>
+      </w:r>
+      <w:r>
+        <w:rPr>
+          <w:rStyle w:val="VerbatimChar"/>
+        </w:rPr>
+        <w:t xml:space="preserve">lja.export</w:t>
+      </w:r>
+      <w:r>
+        <w:t xml:space="preserve"> </w:t>
+      </w:r>
+      <w:r>
+        <w:t xml:space="preserve">commands stop with</w:t>
+      </w:r>
+      <w:r>
+        <w:t xml:space="preserve"> </w:t>
+      </w:r>
+      <w:r>
+        <w:t xml:space="preserve">“</w:t>
+      </w:r>
+      <w:r>
+        <w:t xml:space="preserve">No clustering cache at output/silo_clustering.json</w:t>
+      </w:r>
+      <w:r>
+        <w:t xml:space="preserve">”</w:t>
+      </w:r>
+      <w:r>
+        <w:t xml:space="preserve"> </w:t>
+      </w:r>
+      <w:r>
+        <w:t xml:space="preserve">(finding UAT-01). Pass the same</w:t>
+      </w:r>
+      <w:r>
+        <w:t xml:space="preserve"> </w:t>
+      </w:r>
+      <w:r>
+        <w:rPr>
+          <w:rStyle w:val="VerbatimChar"/>
+        </w:rPr>
+        <w:t xml:space="preserve">--clustering-cache</w:t>
+      </w:r>
+      <w:r>
+        <w:t xml:space="preserve"> </w:t>
+      </w:r>
+      <w:r>
+        <w:t xml:space="preserve">to them, as §9 and §10 show.</w:t>
+      </w:r>
+    </w:p>
+    <w:p>
+      <w:pPr>
+        <w:pStyle w:val="Compact"/>
+        <w:numPr>
+          <w:ilvl w:val="0"/>
+          <w:numId w:val="1013"/>
+        </w:numPr>
+      </w:pPr>
+      <w:r>
+        <w:t xml:space="preserve">Study strategies are written to files but not shown on the dashboard.</w:t>
+      </w:r>
+    </w:p>
+    <w:p>
+      <w:pPr>
+        <w:pStyle w:val="Compact"/>
+        <w:numPr>
+          <w:ilvl w:val="0"/>
+          <w:numId w:val="1013"/>
+        </w:numPr>
+      </w:pPr>
+      <w:r>
         <w:t xml:space="preserve">⚠</w:t>
       </w:r>
       <w:r>
@@ -13075,7 +13844,7 @@
         <w:t xml:space="preserve"> </w:t>
       </w:r>
       <w:r>
-        <w:t xml:space="preserve">on the IOLG-134 branch at</w:t>
+        <w:t xml:space="preserve">on</w:t>
       </w:r>
       <w:r>
         <w:t xml:space="preserve"> </w:t>
@@ -13084,10 +13853,52 @@
         <w:rPr>
           <w:rStyle w:val="VerbatimChar"/>
         </w:rPr>
+        <w:t xml:space="preserve">main</w:t>
+      </w:r>
+      <w:r>
+        <w:t xml:space="preserve"> </w:t>
+      </w:r>
+      <w:r>
+        <w:t xml:space="preserve">at</w:t>
+      </w:r>
+      <w:r>
+        <w:t xml:space="preserve"> </w:t>
+      </w:r>
+      <w:r>
+        <w:rPr>
+          <w:rStyle w:val="VerbatimChar"/>
+        </w:rPr>
+        <w:t xml:space="preserve">cd98ce8</w:t>
+      </w:r>
+      <w:r>
+        <w:t xml:space="preserve"> </w:t>
+      </w:r>
+      <w:r>
+        <w:t xml:space="preserve">(2 October 2026), and for the quiz from the PR #52 branch at</w:t>
+      </w:r>
+      <w:r>
+        <w:t xml:space="preserve"> </w:t>
+      </w:r>
+      <w:r>
+        <w:rPr>
+          <w:rStyle w:val="VerbatimChar"/>
+        </w:rPr>
+        <w:t xml:space="preserve">e203da7</w:t>
+      </w:r>
+      <w:r>
+        <w:t xml:space="preserve">. Part C’s screenshots were taken from the IOLG-134 branch at</w:t>
+      </w:r>
+      <w:r>
+        <w:t xml:space="preserve"> </w:t>
+      </w:r>
+      <w:r>
+        <w:rPr>
+          <w:rStyle w:val="VerbatimChar"/>
+        </w:rPr>
         <w:t xml:space="preserve">0d13e10</w:t>
       </w:r>
       <w:r>
-        <w:t xml:space="preserve">. Part C’s screenshots were taken from that branch serving the reference run (</w:t>
+        <w:t xml:space="preserve">, which merged unchanged as PR #43 on 30 September, serving the reference run (</w:t>
       </w:r>
       <w:r>
         <w:rPr>
@@ -13096,7 +13907,7 @@
         <w:t xml:space="preserve">data-fixtures/reference-run/</w:t>
       </w:r>
       <w:r>
-        <w:t xml:space="preserve">) on 30 September 2026.</w:t>
+        <w:t xml:space="preserve">); no screenshot of the quiz section is included yet.</w:t>
       </w:r>
     </w:p>
     <w:p>
@@ -13270,19 +14081,19 @@
               <w:jc w:val="left"/>
             </w:pPr>
             <w:r>
-              <w:t xml:space="preserve">The agreed cluster-review procedure and sign-off, from the IOLG-124 review (recorded under IOLG-133)</w:t>
-            </w:r>
-          </w:p>
-        </w:tc>
-        <w:tc>
-          <w:tcPr/>
-          <w:p>
-            <w:pPr>
-              <w:pStyle w:val="Compact"/>
-              <w:jc w:val="left"/>
-            </w:pPr>
-            <w:r>
-              <w:t xml:space="preserve">Sui Lung, Istiaque</w:t>
+              <w:t xml:space="preserve">Who signs off a cluster review before it drives a staff report; the owner’s verdict on Sui Lung’s review</w:t>
+            </w:r>
+          </w:p>
+        </w:tc>
+        <w:tc>
+          <w:tcPr/>
+          <w:p>
+            <w:pPr>
+              <w:pStyle w:val="Compact"/>
+              <w:jc w:val="left"/>
+            </w:pPr>
+            <w:r>
+              <w:t xml:space="preserve">Sui Lung, Scott</w:t>
             </w:r>
           </w:p>
         </w:tc>
@@ -13308,7 +14119,7 @@
               <w:jc w:val="left"/>
             </w:pPr>
             <w:r>
-              <w:t xml:space="preserve">Production Moodle connection procedure; whether a Moodle-to-workbook step exists for the dashboard</w:t>
+              <w:t xml:space="preserve">Production Moodle connection procedure</w:t>
             </w:r>
           </w:p>
         </w:tc>
@@ -13334,19 +14145,19 @@
               <w:jc w:val="left"/>
             </w:pPr>
             <w:r>
-              <w:t xml:space="preserve">§22</w:t>
-            </w:r>
-          </w:p>
-        </w:tc>
-        <w:tc>
-          <w:tcPr/>
-          <w:p>
-            <w:pPr>
-              <w:pStyle w:val="Compact"/>
-              <w:jc w:val="left"/>
-            </w:pPr>
-            <w:r>
-              <w:t xml:space="preserve">Confirm the Students-table filter matches competency names</w:t>
+              <w:t xml:space="preserve">§16</w:t>
+            </w:r>
+          </w:p>
+        </w:tc>
+        <w:tc>
+          <w:tcPr/>
+          <w:p>
+            <w:pPr>
+              <w:pStyle w:val="Compact"/>
+              <w:jc w:val="left"/>
+            </w:pPr>
+            <w:r>
+              <w:t xml:space="preserve">A screenshot of the quiz section once PR #52 merges</w:t>
             </w:r>
           </w:p>
         </w:tc>
@@ -13422,7 +14233,7 @@
               <w:jc w:val="left"/>
             </w:pPr>
             <w:r>
-              <w:t xml:space="preserve">Replace reference-run screenshots with the 100-subject cohort once PR #43 is merged, so the pages show a realistic scale</w:t>
+              <w:t xml:space="preserve">Replace reference-run screenshots with the 100-subject cohort, so the pages show a realistic scale</w:t>
             </w:r>
           </w:p>
         </w:tc>
@@ -13668,6 +14479,83 @@
             </w:pPr>
             <w:r>
               <w:t xml:space="preserve">Restructured into Parts A, B and C. Chapters 1 to 4 become Part A, Background. New Part B (producing the data: settings, pipeline, review, plans, export, synthetic cohorts, Moodle) and Part C (every dashboard page with screenshots, typical tasks, limits). Figures sized to stay on one page. Open items listed in Appendix B.</w:t>
+            </w:r>
+          </w:p>
+        </w:tc>
+      </w:tr>
+      <w:tr>
+        <w:tc>
+          <w:tcPr/>
+          <w:p>
+            <w:pPr>
+              <w:pStyle w:val="Compact"/>
+              <w:jc w:val="left"/>
+            </w:pPr>
+            <w:r>
+              <w:t xml:space="preserve">0.3</w:t>
+            </w:r>
+          </w:p>
+        </w:tc>
+        <w:tc>
+          <w:tcPr/>
+          <w:p>
+            <w:pPr>
+              <w:pStyle w:val="Compact"/>
+              <w:jc w:val="left"/>
+            </w:pPr>
+            <w:r>
+              <w:t xml:space="preserve">2 Oct 2026</w:t>
+            </w:r>
+          </w:p>
+        </w:tc>
+        <w:tc>
+          <w:tcPr/>
+          <w:p>
+            <w:pPr>
+              <w:pStyle w:val="Compact"/>
+              <w:jc w:val="left"/>
+            </w:pPr>
+            <w:r>
+              <w:t xml:space="preserve">Allan Campton (drafted with Claude Code)</w:t>
+            </w:r>
+          </w:p>
+        </w:tc>
+        <w:tc>
+          <w:tcPr/>
+          <w:p>
+            <w:pPr>
+              <w:pStyle w:val="Compact"/>
+              <w:jc w:val="left"/>
+            </w:pPr>
+            <w:r>
+              <w:t xml:space="preserve">Brought up to</w:t>
+            </w:r>
+            <w:r>
+              <w:t xml:space="preserve"> </w:t>
+            </w:r>
+            <w:r>
+              <w:rPr>
+                <w:rStyle w:val="VerbatimChar"/>
+              </w:rPr>
+              <w:t xml:space="preserve">main</w:t>
+            </w:r>
+            <w:r>
+              <w:t xml:space="preserve"> </w:t>
+            </w:r>
+            <w:r>
+              <w:t xml:space="preserve">at</w:t>
+            </w:r>
+            <w:r>
+              <w:t xml:space="preserve"> </w:t>
+            </w:r>
+            <w:r>
+              <w:rPr>
+                <w:rStyle w:val="VerbatimChar"/>
+              </w:rPr>
+              <w:t xml:space="preserve">cd98ce8</w:t>
+            </w:r>
+            <w:r>
+              <w:t xml:space="preserve">: the IOLG-134 pages merged (PR #43), so their labels are gone. Practice quiz added to §5.2, §9 and §16, marked (PR #52). §8 records the Sprint 5 cluster review and how reviewer files are kept. §10 export table corrected to the real columns. §12 confirms the dashboard has no Moodle source and no workbook export step exists. §22 answers the filter question (it cannot match competency names). §23 adds findings UAT-01 and UAT-02.</w:t>
             </w:r>
           </w:p>
         </w:tc>

</xml_diff>

<commit_message>
IOLG-106: SMD 0.5 and User Document 0.4 describe the trajectory model
SMD: new section 3.11, decision D19, story D12, configuration rows, repo
map, debt items 7 and 8 resolved to configuration, section 8.2 and
Appendix B reconciled. User Document: settings, the subject chain on the
gap card and how to read it, the subject-order table on This run, glossary,
a typical task, and the limits. Word and PDF rebuilt.

Co-Authored-By: Claude Fable 5.1 <noreply@anthropic.com>
</commit_message>
<xml_diff>
--- a/docs/handover/user-document.docx
+++ b/docs/handover/user-document.docx
@@ -73,7 +73,7 @@
               <w:jc w:val="left"/>
             </w:pPr>
             <w:r>
-              <w:t xml:space="preserve">DRAFT 0.3 — for team review. Part A is complete. Parts B and C are filled from the code and a live run; items marked ⚠</w:t>
+              <w:t xml:space="preserve">DRAFT 0.4 — for team review. Part A is complete. Parts B and C are filled from the code and a live run; items marked ⚠</w:t>
             </w:r>
             <w:r>
               <w:t xml:space="preserve"> </w:t>
@@ -189,7 +189,7 @@
               <w:t xml:space="preserve"> </w:t>
             </w:r>
             <w:r>
-              <w:t xml:space="preserve">(2 Oct 2026). The practice quiz, which is in open pull request #52 (IOLG-136), is marked</w:t>
+              <w:t xml:space="preserve">(2 Oct 2026). The practice quiz, in open pull request #52 (IOLG-136), is marked</w:t>
             </w:r>
             <w:r>
               <w:t xml:space="preserve"> </w:t>
@@ -205,7 +205,17 @@
               <w:t xml:space="preserve"> </w:t>
             </w:r>
             <w:r>
-              <w:t xml:space="preserve">where it appears</w:t>
+              <w:t xml:space="preserve">where it appears; the subject sequence and the subject chain on the gap card, on the IOLG-106 branch this revision ships with, are marked</w:t>
+            </w:r>
+            <w:r>
+              <w:t xml:space="preserve"> </w:t>
+            </w:r>
+            <w:r>
+              <w:rPr>
+                <w:bCs/>
+                <w:b/>
+              </w:rPr>
+              <w:t xml:space="preserve">(IOLG-106)</w:t>
             </w:r>
           </w:p>
         </w:tc>
@@ -4932,6 +4942,177 @@
               <w:rPr>
                 <w:rStyle w:val="VerbatimChar"/>
               </w:rPr>
+              <w:t xml:space="preserve">LJA_SUBJECT_SEQUENCE</w:t>
+            </w:r>
+            <w:r>
+              <w:t xml:space="preserve"> </w:t>
+            </w:r>
+            <w:r>
+              <w:rPr>
+                <w:bCs/>
+                <w:b/>
+              </w:rPr>
+              <w:t xml:space="preserve">(IOLG-106)</w:t>
+            </w:r>
+          </w:p>
+        </w:tc>
+        <w:tc>
+          <w:tcPr/>
+          <w:p>
+            <w:pPr>
+              <w:pStyle w:val="Compact"/>
+              <w:jc w:val="left"/>
+            </w:pPr>
+            <w:r>
+              <w:rPr>
+                <w:rStyle w:val="VerbatimChar"/>
+              </w:rPr>
+              <w:t xml:space="preserve">CSE1OOF,CSE2ALG,CSE3CAP</w:t>
+            </w:r>
+          </w:p>
+        </w:tc>
+        <w:tc>
+          <w:tcPr/>
+          <w:p>
+            <w:pPr>
+              <w:pStyle w:val="Compact"/>
+              <w:jc w:val="left"/>
+            </w:pPr>
+            <w:r>
+              <w:t xml:space="preserve">The order the degree intends the subjects to be taken, comma-separated. This is what</w:t>
+            </w:r>
+            <w:r>
+              <w:t xml:space="preserve"> </w:t>
+            </w:r>
+            <w:r>
+              <w:t xml:space="preserve">“</w:t>
+            </w:r>
+            <w:r>
+              <w:t xml:space="preserve">progress</w:t>
+            </w:r>
+            <w:r>
+              <w:t xml:space="preserve">”</w:t>
+            </w:r>
+            <w:r>
+              <w:t xml:space="preserve"> </w:t>
+            </w:r>
+            <w:r>
+              <w:t xml:space="preserve">and</w:t>
+            </w:r>
+            <w:r>
+              <w:t xml:space="preserve"> </w:t>
+            </w:r>
+            <w:r>
+              <w:t xml:space="preserve">“</w:t>
+            </w:r>
+            <w:r>
+              <w:t xml:space="preserve">trend</w:t>
+            </w:r>
+            <w:r>
+              <w:t xml:space="preserve">”</w:t>
+            </w:r>
+            <w:r>
+              <w:t xml:space="preserve"> </w:t>
+            </w:r>
+            <w:r>
+              <w:t xml:space="preserve">are measured along, and where a course map from the project owner goes. A subject not listed is placed by the digit in its code (</w:t>
+            </w:r>
+            <w:r>
+              <w:rPr>
+                <w:rStyle w:val="VerbatimChar"/>
+              </w:rPr>
+              <w:t xml:space="preserve">CSE2ALG</w:t>
+            </w:r>
+            <w:r>
+              <w:t xml:space="preserve"> </w:t>
+            </w:r>
+            <w:r>
+              <w:t xml:space="preserve">is year 2), and the student’s page says when that happened.</w:t>
+            </w:r>
+          </w:p>
+        </w:tc>
+      </w:tr>
+      <w:tr>
+        <w:tc>
+          <w:tcPr/>
+          <w:p>
+            <w:pPr>
+              <w:pStyle w:val="Compact"/>
+              <w:jc w:val="left"/>
+            </w:pPr>
+            <w:r>
+              <w:rPr>
+                <w:rStyle w:val="VerbatimChar"/>
+              </w:rPr>
+              <w:t xml:space="preserve">LJA_TREND_STABLE_BAND</w:t>
+            </w:r>
+            <w:r>
+              <w:t xml:space="preserve"> </w:t>
+            </w:r>
+            <w:r>
+              <w:rPr>
+                <w:bCs/>
+                <w:b/>
+              </w:rPr>
+              <w:t xml:space="preserve">(IOLG-106)</w:t>
+            </w:r>
+          </w:p>
+        </w:tc>
+        <w:tc>
+          <w:tcPr/>
+          <w:p>
+            <w:pPr>
+              <w:pStyle w:val="Compact"/>
+              <w:jc w:val="left"/>
+            </w:pPr>
+            <w:r>
+              <w:rPr>
+                <w:rStyle w:val="VerbatimChar"/>
+              </w:rPr>
+              <w:t xml:space="preserve">5.0</w:t>
+            </w:r>
+          </w:p>
+        </w:tc>
+        <w:tc>
+          <w:tcPr/>
+          <w:p>
+            <w:pPr>
+              <w:pStyle w:val="Compact"/>
+              <w:jc w:val="left"/>
+            </w:pPr>
+            <w:r>
+              <w:t xml:space="preserve">How many points a competency’s attainment must move between the first and last subject before the trend is called improving or declining rather than stable. Shown on</w:t>
+            </w:r>
+            <w:r>
+              <w:t xml:space="preserve"> </w:t>
+            </w:r>
+            <w:r>
+              <w:t xml:space="preserve">“</w:t>
+            </w:r>
+            <w:r>
+              <w:t xml:space="preserve">This run</w:t>
+            </w:r>
+            <w:r>
+              <w:t xml:space="preserve">”</w:t>
+            </w:r>
+            <w:r>
+              <w:t xml:space="preserve">.</w:t>
+            </w:r>
+          </w:p>
+        </w:tc>
+      </w:tr>
+      <w:tr>
+        <w:tc>
+          <w:tcPr/>
+          <w:p>
+            <w:pPr>
+              <w:pStyle w:val="Compact"/>
+              <w:jc w:val="left"/>
+            </w:pPr>
+            <w:r>
+              <w:rPr>
+                <w:rStyle w:val="VerbatimChar"/>
+              </w:rPr>
               <w:t xml:space="preserve">LJA_DASHBOARD_EXCEL_PATH</w:t>
             </w:r>
             <w:r>
@@ -6082,7 +6263,26 @@
         <w:t xml:space="preserve"> </w:t>
       </w:r>
       <w:r>
-        <w:t xml:space="preserve">on the student page is ordered by year level (first-year subject, then second, then third), not by time.</w:t>
+        <w:t xml:space="preserve">on the student page is ordered by the intended subject sequence (</w:t>
+      </w:r>
+      <w:r>
+        <w:rPr>
+          <w:rStyle w:val="VerbatimChar"/>
+        </w:rPr>
+        <w:t xml:space="preserve">LJA_SUBJECT_SEQUENCE</w:t>
+      </w:r>
+      <w:r>
+        <w:t xml:space="preserve">, §5.2), falling back to the year level in the subject code, not by time.</w:t>
+      </w:r>
+      <w:r>
+        <w:t xml:space="preserve"> </w:t>
+      </w:r>
+      <w:r>
+        <w:rPr>
+          <w:bCs/>
+          <w:b/>
+        </w:rPr>
+        <w:t xml:space="preserve">(IOLG-106)</w:t>
       </w:r>
     </w:p>
     <w:bookmarkEnd w:id="58"/>
@@ -12019,7 +12219,32 @@
         <w:t xml:space="preserve"> </w:t>
       </w:r>
       <w:r>
-        <w:t xml:space="preserve">A line per competency across year levels, for competencies evidenced in two or more subjects, and a table with a trend word (stable, improving, declining, or insufficient evidence). Year order, not time order: the data carries no dates.</w:t>
+        <w:t xml:space="preserve">A line per competency across the subjects in sequence order, for competencies evidenced in two or more subjects, and a table with a trend word (stable, improving, declining, or insufficient evidence). Sequence order, not time order: the data carries no dates. The trend compares the first and last subject sat; a move inside the stable band (5 points by default, §5.2) is</w:t>
+      </w:r>
+      <w:r>
+        <w:t xml:space="preserve"> </w:t>
+      </w:r>
+      <w:r>
+        <w:t xml:space="preserve">“</w:t>
+      </w:r>
+      <w:r>
+        <w:t xml:space="preserve">stable</w:t>
+      </w:r>
+      <w:r>
+        <w:t xml:space="preserve">”</w:t>
+      </w:r>
+      <w:r>
+        <w:t xml:space="preserve">.</w:t>
+      </w:r>
+      <w:r>
+        <w:t xml:space="preserve"> </w:t>
+      </w:r>
+      <w:r>
+        <w:rPr>
+          <w:bCs/>
+          <w:b/>
+        </w:rPr>
+        <w:t xml:space="preserve">(IOLG-106)</w:t>
       </w:r>
     </w:p>
     <w:p>
@@ -12144,18 +12369,155 @@
         <w:t xml:space="preserve"> </w:t>
       </w:r>
       <w:r>
-        <w:t xml:space="preserve">A card per competency, worst first. Open one to see the per-subject evidence (subject, year, attainment, number of observations), the basis of the classification (absolute floor, relative position with the MAD value, or insufficient data), the trend, and, for a gap, the future subjects in the dataset that draw on the same competency. That last line is what turns a flag into an intervention: it names where the student will meet this competency next.</w:t>
-      </w:r>
-    </w:p>
-    <w:p>
-      <w:pPr>
-        <w:pStyle w:val="FirstParagraph"/>
-      </w:pPr>
+        <w:t xml:space="preserve">A card per competency, worst first. Open one to see the per-subject evidence (subject, year, attainment, number of observations), the basis of the classification (absolute floor, relative position with the MAD value, or insufficient data), the trend with its first-to-last change in points, and then the</w:t>
+      </w:r>
+      <w:r>
+        <w:t xml:space="preserve"> </w:t>
+      </w:r>
       <w:r>
         <w:rPr>
           <w:bCs/>
           <w:b/>
         </w:rPr>
+        <w:t xml:space="preserve">subject chain (IOLG-106)</w:t>
+      </w:r>
+      <w:r>
+        <w:t xml:space="preserve">: every subject whose outcomes belong to this competency, in the intended order. A subject the student has sat is a plain chip with their attainment there; a subject still ahead is an amber dashed chip marked</w:t>
+      </w:r>
+      <w:r>
+        <w:t xml:space="preserve"> </w:t>
+      </w:r>
+      <w:r>
+        <w:t xml:space="preserve">“</w:t>
+      </w:r>
+      <w:r>
+        <w:t xml:space="preserve">ahead · prepare</w:t>
+      </w:r>
+      <w:r>
+        <w:t xml:space="preserve">”</w:t>
+      </w:r>
+      <w:r>
+        <w:t xml:space="preserve">. An</w:t>
+      </w:r>
+      <w:r>
+        <w:t xml:space="preserve"> </w:t>
+      </w:r>
+      <w:r>
+        <w:t xml:space="preserve">“</w:t>
+      </w:r>
+      <w:r>
+        <w:t xml:space="preserve">order:</w:t>
+      </w:r>
+      <w:r>
+        <w:t xml:space="preserve">”</w:t>
+      </w:r>
+      <w:r>
+        <w:t xml:space="preserve"> </w:t>
+      </w:r>
+      <w:r>
+        <w:t xml:space="preserve">note says which rule placed them:</w:t>
+      </w:r>
+      <w:r>
+        <w:t xml:space="preserve"> </w:t>
+      </w:r>
+      <w:r>
+        <w:rPr>
+          <w:iCs/>
+          <w:i/>
+        </w:rPr>
+        <w:t xml:space="preserve">declared sequence</w:t>
+      </w:r>
+      <w:r>
+        <w:t xml:space="preserve"> </w:t>
+      </w:r>
+      <w:r>
+        <w:t xml:space="preserve">when the subjects are in</w:t>
+      </w:r>
+      <w:r>
+        <w:t xml:space="preserve"> </w:t>
+      </w:r>
+      <w:r>
+        <w:rPr>
+          <w:rStyle w:val="VerbatimChar"/>
+        </w:rPr>
+        <w:t xml:space="preserve">LJA_SUBJECT_SEQUENCE</w:t>
+      </w:r>
+      <w:r>
+        <w:t xml:space="preserve">,</w:t>
+      </w:r>
+      <w:r>
+        <w:t xml:space="preserve"> </w:t>
+      </w:r>
+      <w:r>
+        <w:rPr>
+          <w:iCs/>
+          <w:i/>
+        </w:rPr>
+        <w:t xml:space="preserve">year digit</w:t>
+      </w:r>
+      <w:r>
+        <w:t xml:space="preserve"> </w:t>
+      </w:r>
+      <w:r>
+        <w:t xml:space="preserve">when they were placed by the digit in their code,</w:t>
+      </w:r>
+      <w:r>
+        <w:t xml:space="preserve"> </w:t>
+      </w:r>
+      <w:r>
+        <w:rPr>
+          <w:iCs/>
+          <w:i/>
+        </w:rPr>
+        <w:t xml:space="preserve">mixed</w:t>
+      </w:r>
+      <w:r>
+        <w:t xml:space="preserve">, or</w:t>
+      </w:r>
+      <w:r>
+        <w:t xml:space="preserve"> </w:t>
+      </w:r>
+      <w:r>
+        <w:rPr>
+          <w:iCs/>
+          <w:i/>
+        </w:rPr>
+        <w:t xml:space="preserve">none</w:t>
+      </w:r>
+      <w:r>
+        <w:t xml:space="preserve"> </w:t>
+      </w:r>
+      <w:r>
+        <w:t xml:space="preserve">when nothing could be ordered. Under the chain, for a gap, the</w:t>
+      </w:r>
+      <w:r>
+        <w:t xml:space="preserve"> </w:t>
+      </w:r>
+      <w:r>
+        <w:t xml:space="preserve">“</w:t>
+      </w:r>
+      <w:r>
+        <w:t xml:space="preserve">flag for intervention</w:t>
+      </w:r>
+      <w:r>
+        <w:t xml:space="preserve">”</w:t>
+      </w:r>
+      <w:r>
+        <w:t xml:space="preserve"> </w:t>
+      </w:r>
+      <w:r>
+        <w:t xml:space="preserve">sentence lists the subjects ahead in order, so the first named is where the student meets this competency next. That is what turns a flag into something to act on before the next assessment rather than after it.</w:t>
+      </w:r>
+    </w:p>
+    <w:p>
+      <w:pPr>
+        <w:pStyle w:val="FirstParagraph"/>
+      </w:pPr>
+      <w:r>
+        <w:rPr>
+          <w:bCs/>
+          <w:b/>
+        </w:rPr>
         <w:t xml:space="preserve">Reading a card.</w:t>
       </w:r>
       <w:r>
@@ -12193,6 +12555,54 @@
       </w:r>
       <w:r>
         <w:t xml:space="preserve">means the mark was acceptable in isolation but well below this student’s own median. Part A §4 walks three real cards.</w:t>
+      </w:r>
+    </w:p>
+    <w:p>
+      <w:pPr>
+        <w:pStyle w:val="BodyText"/>
+      </w:pPr>
+      <w:r>
+        <w:rPr>
+          <w:bCs/>
+          <w:b/>
+        </w:rPr>
+        <w:t xml:space="preserve">Reading the chain.</w:t>
+      </w:r>
+      <w:r>
+        <w:t xml:space="preserve"> </w:t>
+      </w:r>
+      <w:r>
+        <w:t xml:space="preserve">“</w:t>
+      </w:r>
+      <w:r>
+        <w:t xml:space="preserve">CSE1OOF 62.7% → CSE2ALG 64.1% → CSE3CAP ahead · prepare</w:t>
+      </w:r>
+      <w:r>
+        <w:t xml:space="preserve">”</w:t>
+      </w:r>
+      <w:r>
+        <w:t xml:space="preserve"> </w:t>
+      </w:r>
+      <w:r>
+        <w:t xml:space="preserve">says the weakness showed in both first- and second-year subjects and will be assessed again in the capstone; the break before CSE3CAP is the time to work on it, with the learning plan and study strategy above. The chain is an ordering, not a forecast: two or three marks do not make a slope, and</w:t>
+      </w:r>
+      <w:r>
+        <w:t xml:space="preserve"> </w:t>
+      </w:r>
+      <w:r>
+        <w:t xml:space="preserve">“</w:t>
+      </w:r>
+      <w:r>
+        <w:t xml:space="preserve">ahead</w:t>
+      </w:r>
+      <w:r>
+        <w:t xml:space="preserve">”</w:t>
+      </w:r>
+      <w:r>
+        <w:t xml:space="preserve"> </w:t>
+      </w:r>
+      <w:r>
+        <w:t xml:space="preserve">is where the competency comes up next, never a subject to avoid or a reason to change enrolment. On the reference run every student has sat all three subjects, so no chip is marked ahead; the marker appears on the larger synthetic cohorts and on any real cohort part-way through a degree.</w:t>
       </w:r>
     </w:p>
     <w:bookmarkEnd w:id="84"/>
@@ -13160,7 +13570,20 @@
         <w:pStyle w:val="BodyText"/>
       </w:pPr>
       <w:r>
-        <w:t xml:space="preserve">Open this page before quoting any number from the dashboard. It shows the exact command that started it, when, the git version, the workbook, cache and review file; linked input counts; the classification rules as an ordered list with this run’s values; a table with one row per threshold giving the value used, the code default, the environment variable, the CLI flag, and a mark on anything that differs from the default; a histogram of where the flagged marks sit; and, for a synthetic cohort, the generator’s seed and parameters. When the thresholds are ratified under action A-01, this is where the ratified values will be visible.</w:t>
+        <w:t xml:space="preserve">Open this page before quoting any number from the dashboard. It shows the exact command that started it, when, the git version, the workbook, cache and review file; linked input counts; the classification rules as an ordered list with this run’s values; a table with one row per threshold giving the value used, the code default, the environment variable, the CLI flag, and a mark on anything that differs from the default; a histogram of where the flagged marks sit; and, for a synthetic cohort, the generator’s seed and parameters. A further table,</w:t>
+      </w:r>
+      <w:r>
+        <w:t xml:space="preserve"> </w:t>
+      </w:r>
+      <w:r>
+        <w:rPr>
+          <w:bCs/>
+          <w:b/>
+        </w:rPr>
+        <w:t xml:space="preserve">Subject order for progress and trends (IOLG-106)</w:t>
+      </w:r>
+      <w:r>
+        <w:t xml:space="preserve">, shows the declared sequence, the stable band, and how many of this run’s subjects were not in the sequence and so were placed by their year digit. When the thresholds are ratified under action A-01, this is where the ratified values will be visible.</w:t>
       </w:r>
     </w:p>
     <w:bookmarkEnd w:id="112"/>
@@ -13246,7 +13669,20 @@
         <w:pStyle w:val="BodyText"/>
       </w:pPr>
       <w:r>
-        <w:t xml:space="preserve">Every term used on the dashboard, A to Z with a jump list, and MAD with a worked example. Tables and the student page link to it with</w:t>
+        <w:t xml:space="preserve">Every term used on the dashboard, A to Z with a jump list, MAD with a worked example, and (IOLG-106)</w:t>
+      </w:r>
+      <w:r>
+        <w:t xml:space="preserve"> </w:t>
+      </w:r>
+      <w:r>
+        <w:rPr>
+          <w:iCs/>
+          <w:i/>
+        </w:rPr>
+        <w:t xml:space="preserve">trajectory and subject sequence</w:t>
+      </w:r>
+      <w:r>
+        <w:t xml:space="preserve">, which the gap card’s chain links to. Tables and the student page link to it with</w:t>
       </w:r>
       <w:r>
         <w:t xml:space="preserve"> </w:t>
@@ -13375,6 +13811,50 @@
               <w:jc w:val="left"/>
             </w:pPr>
             <w:r>
+              <w:t xml:space="preserve">Tell a student where a weakness comes up next, so they can prepare</w:t>
+            </w:r>
+          </w:p>
+        </w:tc>
+        <w:tc>
+          <w:tcPr/>
+          <w:p>
+            <w:pPr>
+              <w:pStyle w:val="Compact"/>
+              <w:jc w:val="left"/>
+            </w:pPr>
+            <w:r>
+              <w:t xml:space="preserve">Their page, the gap card’s subject chain: the first chip marked</w:t>
+            </w:r>
+            <w:r>
+              <w:t xml:space="preserve"> </w:t>
+            </w:r>
+            <w:r>
+              <w:t xml:space="preserve">“</w:t>
+            </w:r>
+            <w:r>
+              <w:t xml:space="preserve">ahead</w:t>
+            </w:r>
+            <w:r>
+              <w:t xml:space="preserve">”</w:t>
+            </w:r>
+            <w:r>
+              <w:t xml:space="preserve"> </w:t>
+            </w:r>
+            <w:r>
+              <w:t xml:space="preserve">(IOLG-106); then the learning plan and study strategy for what to do about it</w:t>
+            </w:r>
+          </w:p>
+        </w:tc>
+      </w:tr>
+      <w:tr>
+        <w:tc>
+          <w:tcPr/>
+          <w:p>
+            <w:pPr>
+              <w:pStyle w:val="Compact"/>
+              <w:jc w:val="left"/>
+            </w:pPr>
+            <w:r>
               <w:t xml:space="preserve">Check that a flag is not an artefact of the settings</w:t>
             </w:r>
           </w:p>
@@ -13597,7 +14077,7 @@
         <w:t xml:space="preserve"> </w:t>
       </w:r>
       <w:r>
-        <w:t xml:space="preserve">is year-level order.</w:t>
+        <w:t xml:space="preserve">is the declared subject order (IOLG-106), falling back to year level. The default sequence is the three supplied subjects; a real course map from the project owner has not been supplied, so on a larger cohort most subjects are ordered by their year digit and the card says so.</w:t>
       </w:r>
     </w:p>
     <w:p>
@@ -13609,19 +14089,25 @@
         </w:numPr>
       </w:pPr>
       <w:r>
-        <w:t xml:space="preserve">No editing: staff decisions on groups are made with</w:t>
-      </w:r>
-      <w:r>
-        <w:t xml:space="preserve"> </w:t>
-      </w:r>
-      <w:r>
-        <w:rPr>
-          <w:rStyle w:val="VerbatimChar"/>
-        </w:rPr>
-        <w:t xml:space="preserve">lja.review</w:t>
-      </w:r>
-      <w:r>
-        <w:t xml:space="preserve">, not in the browser.</w:t>
+        <w:t xml:space="preserve">The subjects</w:t>
+      </w:r>
+      <w:r>
+        <w:t xml:space="preserve"> </w:t>
+      </w:r>
+      <w:r>
+        <w:t xml:space="preserve">“</w:t>
+      </w:r>
+      <w:r>
+        <w:t xml:space="preserve">ahead</w:t>
+      </w:r>
+      <w:r>
+        <w:t xml:space="preserve">”</w:t>
+      </w:r>
+      <w:r>
+        <w:t xml:space="preserve"> </w:t>
+      </w:r>
+      <w:r>
+        <w:t xml:space="preserve">of a student are inferred from the competency’s subjects they have no results in, not from enrolment records. Reading next semester’s enrolments from Moodle would make it a fact; that is not built.</w:t>
       </w:r>
     </w:p>
     <w:p>
@@ -13633,25 +14119,19 @@
         </w:numPr>
       </w:pPr>
       <w:r>
-        <w:t xml:space="preserve">The seven thresholds are unratified defaults (action A-01). Until then, quote the</w:t>
-      </w:r>
-      <w:r>
-        <w:t xml:space="preserve"> </w:t>
-      </w:r>
-      <w:r>
-        <w:t xml:space="preserve">“</w:t>
-      </w:r>
-      <w:r>
-        <w:t xml:space="preserve">This run</w:t>
-      </w:r>
-      <w:r>
-        <w:t xml:space="preserve">”</w:t>
-      </w:r>
-      <w:r>
-        <w:t xml:space="preserve"> </w:t>
-      </w:r>
-      <w:r>
-        <w:t xml:space="preserve">page with any number.</w:t>
+        <w:t xml:space="preserve">No editing: staff decisions on groups are made with</w:t>
+      </w:r>
+      <w:r>
+        <w:t xml:space="preserve"> </w:t>
+      </w:r>
+      <w:r>
+        <w:rPr>
+          <w:rStyle w:val="VerbatimChar"/>
+        </w:rPr>
+        <w:t xml:space="preserve">lja.review</w:t>
+      </w:r>
+      <w:r>
+        <w:t xml:space="preserve">, not in the browser.</w:t>
       </w:r>
     </w:p>
     <w:p>
@@ -13663,7 +14143,25 @@
         </w:numPr>
       </w:pPr>
       <w:r>
-        <w:t xml:space="preserve">The AI review warning says how many groups were rejected but not which (finding UAT-02, 28 September). The pipeline names the rejected group when it stops; the banner does not yet.</w:t>
+        <w:t xml:space="preserve">The seven thresholds are unratified defaults (action A-01). Until then, quote the</w:t>
+      </w:r>
+      <w:r>
+        <w:t xml:space="preserve"> </w:t>
+      </w:r>
+      <w:r>
+        <w:t xml:space="preserve">“</w:t>
+      </w:r>
+      <w:r>
+        <w:t xml:space="preserve">This run</w:t>
+      </w:r>
+      <w:r>
+        <w:t xml:space="preserve">”</w:t>
+      </w:r>
+      <w:r>
+        <w:t xml:space="preserve"> </w:t>
+      </w:r>
+      <w:r>
+        <w:t xml:space="preserve">page with any number.</w:t>
       </w:r>
     </w:p>
     <w:p>
@@ -13675,82 +14173,7 @@
         </w:numPr>
       </w:pPr>
       <w:r>
-        <w:t xml:space="preserve">After the quick start in §5.3, the bare</w:t>
-      </w:r>
-      <w:r>
-        <w:t xml:space="preserve"> </w:t>
-      </w:r>
-      <w:r>
-        <w:rPr>
-          <w:rStyle w:val="VerbatimChar"/>
-        </w:rPr>
-        <w:t xml:space="preserve">lja.plan</w:t>
-      </w:r>
-      <w:r>
-        <w:t xml:space="preserve">,</w:t>
-      </w:r>
-      <w:r>
-        <w:t xml:space="preserve"> </w:t>
-      </w:r>
-      <w:r>
-        <w:rPr>
-          <w:rStyle w:val="VerbatimChar"/>
-        </w:rPr>
-        <w:t xml:space="preserve">lja.strategy</w:t>
-      </w:r>
-      <w:r>
-        <w:t xml:space="preserve"> </w:t>
-      </w:r>
-      <w:r>
-        <w:t xml:space="preserve">and</w:t>
-      </w:r>
-      <w:r>
-        <w:t xml:space="preserve"> </w:t>
-      </w:r>
-      <w:r>
-        <w:rPr>
-          <w:rStyle w:val="VerbatimChar"/>
-        </w:rPr>
-        <w:t xml:space="preserve">lja.export</w:t>
-      </w:r>
-      <w:r>
-        <w:t xml:space="preserve"> </w:t>
-      </w:r>
-      <w:r>
-        <w:t xml:space="preserve">commands stop with</w:t>
-      </w:r>
-      <w:r>
-        <w:t xml:space="preserve"> </w:t>
-      </w:r>
-      <w:r>
-        <w:t xml:space="preserve">“</w:t>
-      </w:r>
-      <w:r>
-        <w:t xml:space="preserve">No clustering cache at output/silo_clustering.json</w:t>
-      </w:r>
-      <w:r>
-        <w:t xml:space="preserve">”</w:t>
-      </w:r>
-      <w:r>
-        <w:t xml:space="preserve"> </w:t>
-      </w:r>
-      <w:r>
-        <w:t xml:space="preserve">(finding UAT-01). Pass the same</w:t>
-      </w:r>
-      <w:r>
-        <w:t xml:space="preserve"> </w:t>
-      </w:r>
-      <w:r>
-        <w:rPr>
-          <w:rStyle w:val="VerbatimChar"/>
-        </w:rPr>
-        <w:t xml:space="preserve">--clustering-cache</w:t>
-      </w:r>
-      <w:r>
-        <w:t xml:space="preserve"> </w:t>
-      </w:r>
-      <w:r>
-        <w:t xml:space="preserve">to them, as §9 and §10 show.</w:t>
+        <w:t xml:space="preserve">The AI review warning says how many groups were rejected but not which (finding UAT-02, 28 September). The pipeline names the rejected group when it stops; the banner does not yet.</w:t>
       </w:r>
     </w:p>
     <w:p>
@@ -13762,7 +14185,82 @@
         </w:numPr>
       </w:pPr>
       <w:r>
-        <w:t xml:space="preserve">Study strategies are written to files but not shown on the dashboard.</w:t>
+        <w:t xml:space="preserve">After the quick start in §5.3, the bare</w:t>
+      </w:r>
+      <w:r>
+        <w:t xml:space="preserve"> </w:t>
+      </w:r>
+      <w:r>
+        <w:rPr>
+          <w:rStyle w:val="VerbatimChar"/>
+        </w:rPr>
+        <w:t xml:space="preserve">lja.plan</w:t>
+      </w:r>
+      <w:r>
+        <w:t xml:space="preserve">,</w:t>
+      </w:r>
+      <w:r>
+        <w:t xml:space="preserve"> </w:t>
+      </w:r>
+      <w:r>
+        <w:rPr>
+          <w:rStyle w:val="VerbatimChar"/>
+        </w:rPr>
+        <w:t xml:space="preserve">lja.strategy</w:t>
+      </w:r>
+      <w:r>
+        <w:t xml:space="preserve"> </w:t>
+      </w:r>
+      <w:r>
+        <w:t xml:space="preserve">and</w:t>
+      </w:r>
+      <w:r>
+        <w:t xml:space="preserve"> </w:t>
+      </w:r>
+      <w:r>
+        <w:rPr>
+          <w:rStyle w:val="VerbatimChar"/>
+        </w:rPr>
+        <w:t xml:space="preserve">lja.export</w:t>
+      </w:r>
+      <w:r>
+        <w:t xml:space="preserve"> </w:t>
+      </w:r>
+      <w:r>
+        <w:t xml:space="preserve">commands stop with</w:t>
+      </w:r>
+      <w:r>
+        <w:t xml:space="preserve"> </w:t>
+      </w:r>
+      <w:r>
+        <w:t xml:space="preserve">“</w:t>
+      </w:r>
+      <w:r>
+        <w:t xml:space="preserve">No clustering cache at output/silo_clustering.json</w:t>
+      </w:r>
+      <w:r>
+        <w:t xml:space="preserve">”</w:t>
+      </w:r>
+      <w:r>
+        <w:t xml:space="preserve"> </w:t>
+      </w:r>
+      <w:r>
+        <w:t xml:space="preserve">(finding UAT-01). Pass the same</w:t>
+      </w:r>
+      <w:r>
+        <w:t xml:space="preserve"> </w:t>
+      </w:r>
+      <w:r>
+        <w:rPr>
+          <w:rStyle w:val="VerbatimChar"/>
+        </w:rPr>
+        <w:t xml:space="preserve">--clustering-cache</w:t>
+      </w:r>
+      <w:r>
+        <w:t xml:space="preserve"> </w:t>
+      </w:r>
+      <w:r>
+        <w:t xml:space="preserve">to them, as §9 and §10 show.</w:t>
       </w:r>
     </w:p>
     <w:p>
@@ -13774,6 +14272,18 @@
         </w:numPr>
       </w:pPr>
       <w:r>
+        <w:t xml:space="preserve">Study strategies are written to files but not shown on the dashboard.</w:t>
+      </w:r>
+    </w:p>
+    <w:p>
+      <w:pPr>
+        <w:pStyle w:val="Compact"/>
+        <w:numPr>
+          <w:ilvl w:val="0"/>
+          <w:numId w:val="1013"/>
+        </w:numPr>
+      </w:pPr>
+      <w:r>
         <w:t xml:space="preserve">⚠</w:t>
       </w:r>
       <w:r>
@@ -13886,7 +14396,7 @@
         <w:t xml:space="preserve">e203da7</w:t>
       </w:r>
       <w:r>
-        <w:t xml:space="preserve">. Part C’s screenshots were taken from the IOLG-134 branch at</w:t>
+        <w:t xml:space="preserve">; the subject sequence, the chain and the trend band are from the IOLG-106 branch. Part C’s screenshots were taken from the IOLG-134 branch at</w:t>
       </w:r>
       <w:r>
         <w:t xml:space="preserve"> </w:t>
@@ -14157,7 +14667,7 @@
               <w:jc w:val="left"/>
             </w:pPr>
             <w:r>
-              <w:t xml:space="preserve">A screenshot of the quiz section once PR #52 merges</w:t>
+              <w:t xml:space="preserve">A screenshot of the quiz section once PR #52 merges, and of a gap card with a subject marked ahead (needs a cohort where students have not sat every subject)</w:t>
             </w:r>
           </w:p>
         </w:tc>
@@ -14170,6 +14680,56 @@
             </w:pPr>
             <w:r>
               <w:t xml:space="preserve">Allan</w:t>
+            </w:r>
+          </w:p>
+        </w:tc>
+      </w:tr>
+      <w:tr>
+        <w:tc>
+          <w:tcPr/>
+          <w:p>
+            <w:pPr>
+              <w:pStyle w:val="Compact"/>
+              <w:jc w:val="left"/>
+            </w:pPr>
+            <w:r>
+              <w:t xml:space="preserve">§5.2</w:t>
+            </w:r>
+          </w:p>
+        </w:tc>
+        <w:tc>
+          <w:tcPr/>
+          <w:p>
+            <w:pPr>
+              <w:pStyle w:val="Compact"/>
+              <w:jc w:val="left"/>
+            </w:pPr>
+            <w:r>
+              <w:t xml:space="preserve">The course map for</w:t>
+            </w:r>
+            <w:r>
+              <w:t xml:space="preserve"> </w:t>
+            </w:r>
+            <w:r>
+              <w:rPr>
+                <w:rStyle w:val="VerbatimChar"/>
+              </w:rPr>
+              <w:t xml:space="preserve">LJA_SUBJECT_SEQUENCE</w:t>
+            </w:r>
+            <w:r>
+              <w:t xml:space="preserve">, per degree</w:t>
+            </w:r>
+          </w:p>
+        </w:tc>
+        <w:tc>
+          <w:tcPr/>
+          <w:p>
+            <w:pPr>
+              <w:pStyle w:val="Compact"/>
+              <w:jc w:val="left"/>
+            </w:pPr>
+            <w:r>
+              <w:t xml:space="preserve">Scott</w:t>
             </w:r>
           </w:p>
         </w:tc>
@@ -14556,6 +15116,56 @@
             </w:r>
             <w:r>
               <w:t xml:space="preserve">: the IOLG-134 pages merged (PR #43), so their labels are gone. Practice quiz added to §5.2, §9 and §16, marked (PR #52). §8 records the Sprint 5 cluster review and how reviewer files are kept. §10 export table corrected to the real columns. §12 confirms the dashboard has no Moodle source and no workbook export step exists. §22 answers the filter question (it cannot match competency names). §23 adds findings UAT-01 and UAT-02.</w:t>
+            </w:r>
+          </w:p>
+        </w:tc>
+      </w:tr>
+      <w:tr>
+        <w:tc>
+          <w:tcPr/>
+          <w:p>
+            <w:pPr>
+              <w:pStyle w:val="Compact"/>
+              <w:jc w:val="left"/>
+            </w:pPr>
+            <w:r>
+              <w:t xml:space="preserve">0.4</w:t>
+            </w:r>
+          </w:p>
+        </w:tc>
+        <w:tc>
+          <w:tcPr/>
+          <w:p>
+            <w:pPr>
+              <w:pStyle w:val="Compact"/>
+              <w:jc w:val="left"/>
+            </w:pPr>
+            <w:r>
+              <w:t xml:space="preserve">2 Oct 2026</w:t>
+            </w:r>
+          </w:p>
+        </w:tc>
+        <w:tc>
+          <w:tcPr/>
+          <w:p>
+            <w:pPr>
+              <w:pStyle w:val="Compact"/>
+              <w:jc w:val="left"/>
+            </w:pPr>
+            <w:r>
+              <w:t xml:space="preserve">Allan Campton (drafted with Claude Code)</w:t>
+            </w:r>
+          </w:p>
+        </w:tc>
+        <w:tc>
+          <w:tcPr/>
+          <w:p>
+            <w:pPr>
+              <w:pStyle w:val="Compact"/>
+              <w:jc w:val="left"/>
+            </w:pPr>
+            <w:r>
+              <w:t xml:space="preserve">IOLG-106: the subject sequence and trend band settings (§5.2), the subject chain on every gap card and how to read it (§16), the subject-order table on This run (§20), the glossary entry (§21), a typical task (§22) and the limits (§23). Marked (IOLG-106); ships on that branch.</w:t>
             </w:r>
           </w:p>
         </w:tc>

</xml_diff>

<commit_message>
IOLG-106: explain the trajectory in Part A of the User Document, with a worked chart
User Document 0.4: new section 4.5 in the Background part explains what a
trajectory is, draws one (Figure 5b, STU0834 from the 100-subject cohort:
four first-year maths subjects declining, two second-year subjects ahead),
says what to read off it and what it is not, and records the large-cohort
caveat: without a course map "ahead" is every subject in the competency
the student has no results in, including other degrees' subjects. Section
16 links the gap card's chain to it; the Provenance page name from PR #54
is used throughout.

SMD 0.5: Figure 5c and the unfiltered-ahead finding in section 3.11;
section 8.2 names program filtering as the first follow-up.

Co-Authored-By: Claude Fable 5.1 <noreply@anthropic.com>
</commit_message>
<xml_diff>
--- a/docs/handover/user-document.docx
+++ b/docs/handover/user-document.docx
@@ -552,7 +552,7 @@
     </w:p>
     <w:bookmarkEnd w:id="20"/>
     <w:bookmarkEnd w:id="21"/>
-    <w:bookmarkStart w:id="53" w:name="part-a.-background"/>
+    <w:bookmarkStart w:id="57" w:name="part-a.-background"/>
     <w:p>
       <w:pPr>
         <w:pStyle w:val="Heading1"/>
@@ -2144,7 +2144,7 @@
     </w:p>
     <w:bookmarkEnd w:id="37"/>
     <w:bookmarkEnd w:id="38"/>
-    <w:bookmarkStart w:id="52" w:name="one-real-student-from-each-group"/>
+    <w:bookmarkStart w:id="56" w:name="one-real-student-from-each-group"/>
     <w:p>
       <w:pPr>
         <w:pStyle w:val="Heading2"/>
@@ -4247,6 +4247,465 @@
         </w:tc>
       </w:tr>
     </w:tbl>
+    <w:bookmarkEnd w:id="51"/>
+    <w:bookmarkStart w:id="55" w:name="Xae59ed6b94677cc64404008cc17520f1813b67f"/>
+    <w:p>
+      <w:pPr>
+        <w:pStyle w:val="Heading3"/>
+      </w:pPr>
+      <w:r>
+        <w:t xml:space="preserve">4.5 Progress along the sequence: a trajectory (IOLG-106)</w:t>
+      </w:r>
+    </w:p>
+    <w:p>
+      <w:pPr>
+        <w:pStyle w:val="FirstParagraph"/>
+      </w:pPr>
+      <w:r>
+        <w:t xml:space="preserve">The three students above are each a snapshot: one number per competency, and a verdict. The product also has to answer the question the project owner put first,</w:t>
+      </w:r>
+      <w:r>
+        <w:t xml:space="preserve"> </w:t>
+      </w:r>
+      <w:r>
+        <w:t xml:space="preserve">“</w:t>
+      </w:r>
+      <w:r>
+        <w:t xml:space="preserve">a gap in first year, consequence in third year</w:t>
+      </w:r>
+      <w:r>
+        <w:t xml:space="preserve">”</w:t>
+      </w:r>
+      <w:r>
+        <w:t xml:space="preserve">: is a weakness recurring as the student moves through the degree, and where will it be assessed next? The object that answers it is a</w:t>
+      </w:r>
+      <w:r>
+        <w:t xml:space="preserve"> </w:t>
+      </w:r>
+      <w:r>
+        <w:rPr>
+          <w:bCs/>
+          <w:b/>
+        </w:rPr>
+        <w:t xml:space="preserve">trajectory</w:t>
+      </w:r>
+      <w:r>
+        <w:t xml:space="preserve">.</w:t>
+      </w:r>
+    </w:p>
+    <w:p>
+      <w:pPr>
+        <w:pStyle w:val="BodyText"/>
+      </w:pPr>
+      <w:r>
+        <w:t xml:space="preserve">A trajectory takes one student and one competency, finds every subject whose outcomes belong to that competency, and lines them up in the order the degree intends them to be taken. For each subject the student has sat it carries their attainment there (the same per-subject figure as the gap card’s evidence table); each subject they have not sat is placed where it will come, marked</w:t>
+      </w:r>
+      <w:r>
+        <w:t xml:space="preserve"> </w:t>
+      </w:r>
+      <w:r>
+        <w:rPr>
+          <w:bCs/>
+          <w:b/>
+        </w:rPr>
+        <w:t xml:space="preserve">ahead</w:t>
+      </w:r>
+      <w:r>
+        <w:t xml:space="preserve">. The trend compares the first and last subjects sat: more than a set number of points up is</w:t>
+      </w:r>
+      <w:r>
+        <w:t xml:space="preserve"> </w:t>
+      </w:r>
+      <w:r>
+        <w:rPr>
+          <w:iCs/>
+          <w:i/>
+        </w:rPr>
+        <w:t xml:space="preserve">improving</w:t>
+      </w:r>
+      <w:r>
+        <w:t xml:space="preserve">, more than that down is</w:t>
+      </w:r>
+      <w:r>
+        <w:t xml:space="preserve"> </w:t>
+      </w:r>
+      <w:r>
+        <w:rPr>
+          <w:iCs/>
+          <w:i/>
+        </w:rPr>
+        <w:t xml:space="preserve">declining</w:t>
+      </w:r>
+      <w:r>
+        <w:t xml:space="preserve">, anything inside the band is</w:t>
+      </w:r>
+      <w:r>
+        <w:t xml:space="preserve"> </w:t>
+      </w:r>
+      <w:r>
+        <w:rPr>
+          <w:iCs/>
+          <w:i/>
+        </w:rPr>
+        <w:t xml:space="preserve">stable</w:t>
+      </w:r>
+      <w:r>
+        <w:t xml:space="preserve">, and fewer than two subjects is</w:t>
+      </w:r>
+      <w:r>
+        <w:t xml:space="preserve"> </w:t>
+      </w:r>
+      <w:r>
+        <w:rPr>
+          <w:iCs/>
+          <w:i/>
+        </w:rPr>
+        <w:t xml:space="preserve">insufficient evidence</w:t>
+      </w:r>
+      <w:r>
+        <w:t xml:space="preserve">. The band is 5 points by default (§5.2) and, like the seven thresholds, is a proposal rather than a ratified value.</w:t>
+      </w:r>
+    </w:p>
+    <w:p>
+      <w:pPr>
+        <w:pStyle w:val="BodyText"/>
+      </w:pPr>
+      <w:r>
+        <w:drawing>
+          <wp:inline>
+            <wp:extent cx="5334000" cy="2607733"/>
+            <wp:effectExtent b="0" l="0" r="0" t="0"/>
+            <wp:docPr descr="" title="" id="53" name="Picture"/>
+            <a:graphic>
+              <a:graphicData uri="http://schemas.openxmlformats.org/drawingml/2006/picture">
+                <pic:pic>
+                  <pic:nvPicPr>
+                    <pic:cNvPr descr="diagrams/15-trajectory-STU0834.png" id="54" name="Picture"/>
+                    <pic:cNvPicPr>
+                      <a:picLocks noChangeArrowheads="1" noChangeAspect="1"/>
+                    </pic:cNvPicPr>
+                  </pic:nvPicPr>
+                  <pic:blipFill>
+                    <a:blip r:embed="rId52"/>
+                    <a:stretch>
+                      <a:fillRect/>
+                    </a:stretch>
+                  </pic:blipFill>
+                  <pic:spPr bwMode="auto">
+                    <a:xfrm>
+                      <a:off x="0" y="0"/>
+                      <a:ext cx="5334000" cy="2607733"/>
+                    </a:xfrm>
+                    <a:prstGeom prst="rect">
+                      <a:avLst/>
+                    </a:prstGeom>
+                    <a:noFill/>
+                    <a:ln w="9525">
+                      <a:noFill/>
+                      <a:headEnd/>
+                      <a:tailEnd/>
+                    </a:ln>
+                  </pic:spPr>
+                </pic:pic>
+              </a:graphicData>
+            </a:graphic>
+          </wp:inline>
+        </w:drawing>
+      </w:r>
+    </w:p>
+    <w:p>
+      <w:pPr>
+        <w:pStyle w:val="BodyText"/>
+      </w:pPr>
+      <w:r>
+        <w:rPr>
+          <w:iCs/>
+          <w:i/>
+        </w:rPr>
+        <w:t xml:space="preserve">Figure 5b: STU0834’s trajectory in Expressing mathematical arguments, from the 100-subject cohort. Four first-year maths subjects sat, 61% down to 49%, with the last below the floor; two second-year maths subjects ahead. Competency attainment 59.2% is a persistent gap by relative position. The dashboard shows the same thing as a row of chips on the gap card (§16).</w:t>
+      </w:r>
+    </w:p>
+    <w:p>
+      <w:pPr>
+        <w:pStyle w:val="BodyText"/>
+      </w:pPr>
+      <w:r>
+        <w:t xml:space="preserve">Three things to read off the figure, because they are the three things the chain on the gap card is for:</w:t>
+      </w:r>
+    </w:p>
+    <w:p>
+      <w:pPr>
+        <w:pStyle w:val="Compact"/>
+        <w:numPr>
+          <w:ilvl w:val="0"/>
+          <w:numId w:val="1008"/>
+        </w:numPr>
+      </w:pPr>
+      <w:r>
+        <w:rPr>
+          <w:bCs/>
+          <w:b/>
+        </w:rPr>
+        <w:t xml:space="preserve">The shape.</w:t>
+      </w:r>
+      <w:r>
+        <w:t xml:space="preserve"> </w:t>
+      </w:r>
+      <w:r>
+        <w:t xml:space="preserve">Four marks that drift down across first year are a different story from one bad mark, and the verdict (persistent gap, by relative position) is the same either way. The chain shows which story it is.</w:t>
+      </w:r>
+    </w:p>
+    <w:p>
+      <w:pPr>
+        <w:pStyle w:val="Compact"/>
+        <w:numPr>
+          <w:ilvl w:val="0"/>
+          <w:numId w:val="1008"/>
+        </w:numPr>
+      </w:pPr>
+      <w:r>
+        <w:rPr>
+          <w:bCs/>
+          <w:b/>
+        </w:rPr>
+        <w:t xml:space="preserve">Where it comes next.</w:t>
+      </w:r>
+      <w:r>
+        <w:t xml:space="preserve"> </w:t>
+      </w:r>
+      <w:r>
+        <w:t xml:space="preserve">MAT2LAL and MAT2VCA are ahead, and they assess this competency. That makes the break before second year the moment to work on it, with the learning plan and study strategy (§9) saying what and how. The dashboard labels those subjects</w:t>
+      </w:r>
+      <w:r>
+        <w:t xml:space="preserve"> </w:t>
+      </w:r>
+      <w:r>
+        <w:t xml:space="preserve">“</w:t>
+      </w:r>
+      <w:r>
+        <w:t xml:space="preserve">ahead · prepare</w:t>
+      </w:r>
+      <w:r>
+        <w:t xml:space="preserve">”</w:t>
+      </w:r>
+      <w:r>
+        <w:t xml:space="preserve">.</w:t>
+      </w:r>
+    </w:p>
+    <w:p>
+      <w:pPr>
+        <w:pStyle w:val="Compact"/>
+        <w:numPr>
+          <w:ilvl w:val="0"/>
+          <w:numId w:val="1008"/>
+        </w:numPr>
+      </w:pPr>
+      <w:r>
+        <w:rPr>
+          <w:bCs/>
+          <w:b/>
+        </w:rPr>
+        <w:t xml:space="preserve">What it is not.</w:t>
+      </w:r>
+      <w:r>
+        <w:t xml:space="preserve"> </w:t>
+      </w:r>
+      <w:r>
+        <w:t xml:space="preserve">A forecast. Four marks are an ordering, not a slope, and the hollow markers have no value; their height on the chart is only where the eye lands.</w:t>
+      </w:r>
+      <w:r>
+        <w:t xml:space="preserve"> </w:t>
+      </w:r>
+      <w:r>
+        <w:t xml:space="preserve">“</w:t>
+      </w:r>
+      <w:r>
+        <w:t xml:space="preserve">Ahead</w:t>
+      </w:r>
+      <w:r>
+        <w:t xml:space="preserve">”</w:t>
+      </w:r>
+      <w:r>
+        <w:t xml:space="preserve"> </w:t>
+      </w:r>
+      <w:r>
+        <w:t xml:space="preserve">means the competency is assessed there, never that the student should or should not enrol: subject choice is an academic decision whose rules the system does not hold.</w:t>
+      </w:r>
+    </w:p>
+    <w:p>
+      <w:pPr>
+        <w:pStyle w:val="FirstParagraph"/>
+      </w:pPr>
+      <w:r>
+        <w:rPr>
+          <w:bCs/>
+          <w:b/>
+        </w:rPr>
+        <w:t xml:space="preserve">Where the order comes from.</w:t>
+      </w:r>
+      <w:r>
+        <w:t xml:space="preserve"> </w:t>
+      </w:r>
+      <w:r>
+        <w:t xml:space="preserve">The intended sequence is declared in one setting,</w:t>
+      </w:r>
+      <w:r>
+        <w:t xml:space="preserve"> </w:t>
+      </w:r>
+      <w:r>
+        <w:rPr>
+          <w:rStyle w:val="VerbatimChar"/>
+        </w:rPr>
+        <w:t xml:space="preserve">LJA_SUBJECT_SEQUENCE</w:t>
+      </w:r>
+      <w:r>
+        <w:t xml:space="preserve"> </w:t>
+      </w:r>
+      <w:r>
+        <w:t xml:space="preserve">(§5.2); that is where the project owner’s course map goes when one is supplied. A subject not in it is placed by the year digit in its code, and subjects in the same year have no order between them, so in the figure the four first-year subjects are alphabetical. Every trajectory states which rule placed it (</w:t>
+      </w:r>
+      <w:r>
+        <w:t xml:space="preserve">“</w:t>
+      </w:r>
+      <w:r>
+        <w:t xml:space="preserve">order: declared sequence</w:t>
+      </w:r>
+      <w:r>
+        <w:t xml:space="preserve">”</w:t>
+      </w:r>
+      <w:r>
+        <w:t xml:space="preserve">,</w:t>
+      </w:r>
+      <w:r>
+        <w:t xml:space="preserve"> </w:t>
+      </w:r>
+      <w:r>
+        <w:t xml:space="preserve">“</w:t>
+      </w:r>
+      <w:r>
+        <w:t xml:space="preserve">year digit</w:t>
+      </w:r>
+      <w:r>
+        <w:t xml:space="preserve">”</w:t>
+      </w:r>
+      <w:r>
+        <w:t xml:space="preserve">,</w:t>
+      </w:r>
+      <w:r>
+        <w:t xml:space="preserve"> </w:t>
+      </w:r>
+      <w:r>
+        <w:t xml:space="preserve">“</w:t>
+      </w:r>
+      <w:r>
+        <w:t xml:space="preserve">mixed</w:t>
+      </w:r>
+      <w:r>
+        <w:t xml:space="preserve">”</w:t>
+      </w:r>
+      <w:r>
+        <w:t xml:space="preserve"> </w:t>
+      </w:r>
+      <w:r>
+        <w:t xml:space="preserve">or</w:t>
+      </w:r>
+      <w:r>
+        <w:t xml:space="preserve"> </w:t>
+      </w:r>
+      <w:r>
+        <w:t xml:space="preserve">“</w:t>
+      </w:r>
+      <w:r>
+        <w:t xml:space="preserve">none</w:t>
+      </w:r>
+      <w:r>
+        <w:t xml:space="preserve">”</w:t>
+      </w:r>
+      <w:r>
+        <w:t xml:space="preserve">), in the same spirit as every gap stating its classification basis. The data carries no dates, so this is order, not time, and every page that shows a trajectory says so.</w:t>
+      </w:r>
+    </w:p>
+    <w:p>
+      <w:pPr>
+        <w:pStyle w:val="BodyText"/>
+      </w:pPr>
+      <w:r>
+        <w:rPr>
+          <w:bCs/>
+          <w:b/>
+        </w:rPr>
+        <w:t xml:space="preserve">A caveat on large cohorts.</w:t>
+      </w:r>
+      <w:r>
+        <w:t xml:space="preserve"> </w:t>
+      </w:r>
+      <w:r>
+        <w:t xml:space="preserve">Without a course map,</w:t>
+      </w:r>
+      <w:r>
+        <w:t xml:space="preserve"> </w:t>
+      </w:r>
+      <w:r>
+        <w:t xml:space="preserve">“</w:t>
+      </w:r>
+      <w:r>
+        <w:t xml:space="preserve">ahead</w:t>
+      </w:r>
+      <w:r>
+        <w:t xml:space="preserve">”</w:t>
+      </w:r>
+      <w:r>
+        <w:t xml:space="preserve"> </w:t>
+      </w:r>
+      <w:r>
+        <w:t xml:space="preserve">means every subject in the competency the student has no results in. On the three-subject workbook that is exact. On the 100-subject cohort a competency such as scientific communication spans fifteen subjects across seven degrees, so a biochemistry student’s chain lists agriculture and engineering subjects they will never take, and a second-year student’s chain can show a first-year subject they skipped as</w:t>
+      </w:r>
+      <w:r>
+        <w:t xml:space="preserve"> </w:t>
+      </w:r>
+      <w:r>
+        <w:t xml:space="preserve">“</w:t>
+      </w:r>
+      <w:r>
+        <w:t xml:space="preserve">ahead</w:t>
+      </w:r>
+      <w:r>
+        <w:t xml:space="preserve">”</w:t>
+      </w:r>
+      <w:r>
+        <w:t xml:space="preserve">. The chain is still correct about where the competency is assessed; it is not yet filtered to the student’s own degree. That filter is what the course map provides, and until it is supplied the chain should be read as</w:t>
+      </w:r>
+      <w:r>
+        <w:t xml:space="preserve"> </w:t>
+      </w:r>
+      <w:r>
+        <w:t xml:space="preserve">“</w:t>
+      </w:r>
+      <w:r>
+        <w:t xml:space="preserve">subjects that assess this</w:t>
+      </w:r>
+      <w:r>
+        <w:t xml:space="preserve">”</w:t>
+      </w:r>
+      <w:r>
+        <w:t xml:space="preserve">, not</w:t>
+      </w:r>
+      <w:r>
+        <w:t xml:space="preserve"> </w:t>
+      </w:r>
+      <w:r>
+        <w:t xml:space="preserve">“</w:t>
+      </w:r>
+      <w:r>
+        <w:t xml:space="preserve">your next subjects</w:t>
+      </w:r>
+      <w:r>
+        <w:t xml:space="preserve">”</w:t>
+      </w:r>
+      <w:r>
+        <w:t xml:space="preserve">.</w:t>
+      </w:r>
+    </w:p>
     <w:p>
       <w:r>
         <w:pict>
@@ -4261,10 +4720,10 @@
         </w:pict>
       </w:r>
     </w:p>
-    <w:bookmarkEnd w:id="51"/>
-    <w:bookmarkEnd w:id="52"/>
-    <w:bookmarkEnd w:id="53"/>
-    <w:bookmarkStart w:id="71" w:name="part-b.-producing-the-data"/>
+    <w:bookmarkEnd w:id="55"/>
+    <w:bookmarkEnd w:id="56"/>
+    <w:bookmarkEnd w:id="57"/>
+    <w:bookmarkStart w:id="75" w:name="part-b.-producing-the-data"/>
     <w:p>
       <w:pPr>
         <w:pStyle w:val="Heading1"/>
@@ -4343,7 +4802,7 @@
         <w:t xml:space="preserve">conda environment active.</w:t>
       </w:r>
     </w:p>
-    <w:bookmarkStart w:id="57" w:name="before-you-start"/>
+    <w:bookmarkStart w:id="61" w:name="before-you-start"/>
     <w:p>
       <w:pPr>
         <w:pStyle w:val="Heading2"/>
@@ -4352,7 +4811,7 @@
         <w:t xml:space="preserve">5. Before you start</w:t>
       </w:r>
     </w:p>
-    <w:bookmarkStart w:id="54" w:name="set-up-once"/>
+    <w:bookmarkStart w:id="58" w:name="set-up-once"/>
     <w:p>
       <w:pPr>
         <w:pStyle w:val="Heading3"/>
@@ -4487,8 +4946,8 @@
         <w:t xml:space="preserve">file holds the settings below. Nothing in it is needed to run the offline reference run in §5.3, so a first look at the dashboard needs no language model and no Moodle.</w:t>
       </w:r>
     </w:p>
-    <w:bookmarkEnd w:id="54"/>
-    <w:bookmarkStart w:id="55" w:name="settings-in-.env"/>
+    <w:bookmarkEnd w:id="58"/>
+    <w:bookmarkStart w:id="59" w:name="settings-in-.env"/>
     <w:p>
       <w:pPr>
         <w:pStyle w:val="Heading3"/>
@@ -5495,8 +5954,8 @@
         </w:tc>
       </w:tr>
     </w:tbl>
-    <w:bookmarkEnd w:id="55"/>
-    <w:bookmarkStart w:id="56" w:name="the-quickest-first-run"/>
+    <w:bookmarkEnd w:id="59"/>
+    <w:bookmarkStart w:id="60" w:name="the-quickest-first-run"/>
     <w:p>
       <w:pPr>
         <w:pStyle w:val="Heading3"/>
@@ -5730,9 +6189,9 @@
         <w:t xml:space="preserve">. Keep the reference review file all-confirmed: a rejected group makes the pipeline stop with exit code 2 and breaks every offline run built on it.</w:t>
       </w:r>
     </w:p>
-    <w:bookmarkEnd w:id="56"/>
-    <w:bookmarkEnd w:id="57"/>
-    <w:bookmarkStart w:id="58" w:name="Xba5c1ba11bf54b49222c14c7293288f20debe94"/>
+    <w:bookmarkEnd w:id="60"/>
+    <w:bookmarkEnd w:id="61"/>
+    <w:bookmarkStart w:id="62" w:name="Xba5c1ba11bf54b49222c14c7293288f20debe94"/>
     <w:p>
       <w:pPr>
         <w:pStyle w:val="Heading2"/>
@@ -6197,7 +6656,7 @@
         <w:pStyle w:val="Compact"/>
         <w:numPr>
           <w:ilvl w:val="0"/>
-          <w:numId w:val="1008"/>
+          <w:numId w:val="1009"/>
         </w:numPr>
       </w:pPr>
       <w:r>
@@ -6237,7 +6696,7 @@
         <w:pStyle w:val="Compact"/>
         <w:numPr>
           <w:ilvl w:val="0"/>
-          <w:numId w:val="1008"/>
+          <w:numId w:val="1009"/>
         </w:numPr>
       </w:pPr>
       <w:r>
@@ -6285,8 +6744,8 @@
         <w:t xml:space="preserve">(IOLG-106)</w:t>
       </w:r>
     </w:p>
-    <w:bookmarkEnd w:id="58"/>
-    <w:bookmarkStart w:id="62" w:name="running-the-pipeline-python--m-lja.cli"/>
+    <w:bookmarkEnd w:id="62"/>
+    <w:bookmarkStart w:id="66" w:name="running-the-pipeline-python--m-lja.cli"/>
     <w:p>
       <w:pPr>
         <w:pStyle w:val="Heading2"/>
@@ -6383,7 +6842,7 @@
         <w:t xml:space="preserve">]</w:t>
       </w:r>
     </w:p>
-    <w:bookmarkStart w:id="59" w:name="what-comes-out"/>
+    <w:bookmarkStart w:id="63" w:name="what-comes-out"/>
     <w:p>
       <w:pPr>
         <w:pStyle w:val="Heading3"/>
@@ -6731,8 +7190,8 @@
         </w:tc>
       </w:tr>
     </w:tbl>
-    <w:bookmarkEnd w:id="59"/>
-    <w:bookmarkStart w:id="60" w:name="options"/>
+    <w:bookmarkEnd w:id="63"/>
+    <w:bookmarkStart w:id="64" w:name="options"/>
     <w:p>
       <w:pPr>
         <w:pStyle w:val="Heading3"/>
@@ -7374,8 +7833,8 @@
         <w:t xml:space="preserve">was not given. If a cached clustering does not cover every SILO in the workbook (for example after adding a subject), the model is called again automatically.</w:t>
       </w:r>
     </w:p>
-    <w:bookmarkEnd w:id="60"/>
-    <w:bookmarkStart w:id="61" w:name="which-settings-for-which-question"/>
+    <w:bookmarkEnd w:id="64"/>
+    <w:bookmarkStart w:id="65" w:name="which-settings-for-which-question"/>
     <w:p>
       <w:pPr>
         <w:pStyle w:val="Heading3"/>
@@ -7729,9 +8188,9 @@
         </w:tc>
       </w:tr>
     </w:tbl>
-    <w:bookmarkEnd w:id="61"/>
-    <w:bookmarkEnd w:id="62"/>
-    <w:bookmarkStart w:id="63" w:name="X0fd953a984c0a9b790ded73d24183dec73b10ac"/>
+    <w:bookmarkEnd w:id="65"/>
+    <w:bookmarkEnd w:id="66"/>
+    <w:bookmarkStart w:id="67" w:name="X0fd953a984c0a9b790ded73d24183dec73b10ac"/>
     <w:p>
       <w:pPr>
         <w:pStyle w:val="Heading2"/>
@@ -8150,8 +8609,8 @@
         <w:t xml:space="preserve">TO FILL: who signs off a review before it drives a report for staff, and whether the project owner confirms or overrules at the 4/5 October review.</w:t>
       </w:r>
     </w:p>
-    <w:bookmarkEnd w:id="63"/>
-    <w:bookmarkStart w:id="64" w:name="X4f4b51cce8731b0d7d1994fadbe359bfcedca57"/>
+    <w:bookmarkEnd w:id="67"/>
+    <w:bookmarkStart w:id="68" w:name="X4f4b51cce8731b0d7d1994fadbe359bfcedca57"/>
     <w:p>
       <w:pPr>
         <w:pStyle w:val="Heading2"/>
@@ -9050,8 +9509,8 @@
         <w:t xml:space="preserve">All three are AI-generated documents. The grounding check proves every competency, subject and assessment named exists and belongs to that student. It does not prove the advice is good, and for a quiz it cannot prove the marked answer is correct: the only subject matter the model is given is the outcome wording, the assessment names, the marker’s feedback and the handbook synopsis, so the question and its answer come from the model’s general knowledge. The blind second pass catches a disagreement, not a shared blind spot (on the first live run the same model agreed confidently with a question a tutor could mark the other way). Nothing here is student-facing until staff have read it; the dashboard says so above every plan and every quiz.</w:t>
       </w:r>
     </w:p>
-    <w:bookmarkEnd w:id="64"/>
-    <w:bookmarkStart w:id="65" w:name="X2dd748246146856743cdfa8f590beb6fa276027"/>
+    <w:bookmarkEnd w:id="68"/>
+    <w:bookmarkStart w:id="69" w:name="X2dd748246146856743cdfa8f590beb6fa276027"/>
     <w:p>
       <w:pPr>
         <w:pStyle w:val="Heading2"/>
@@ -9382,8 +9841,8 @@
         <w:t xml:space="preserve">.</w:t>
       </w:r>
     </w:p>
-    <w:bookmarkEnd w:id="65"/>
-    <w:bookmarkStart w:id="69" w:name="making-a-synthetic-cohort"/>
+    <w:bookmarkEnd w:id="69"/>
+    <w:bookmarkStart w:id="73" w:name="making-a-synthetic-cohort"/>
     <w:p>
       <w:pPr>
         <w:pStyle w:val="Heading2"/>
@@ -9416,7 +9875,7 @@
         <w:t xml:space="preserve">for anything beyond the supplied three subjects; it is the one that gives students a hidden ability per competency, which is what the product is supposed to detect.</w:t>
       </w:r>
     </w:p>
-    <w:bookmarkStart w:id="66" w:name="python--m-lja.data.catalogue_generator"/>
+    <w:bookmarkStart w:id="70" w:name="python--m-lja.data.catalogue_generator"/>
     <w:p>
       <w:pPr>
         <w:pStyle w:val="Heading3"/>
@@ -10316,8 +10775,8 @@
         <w:t xml:space="preserve">makes natural dips as deep as the planted ones. That finding is recorded on IOLG-134 and feeds action A-01.</w:t>
       </w:r>
     </w:p>
-    <w:bookmarkEnd w:id="66"/>
-    <w:bookmarkStart w:id="67" w:name="python--m-lja.data.synth_generator"/>
+    <w:bookmarkEnd w:id="70"/>
+    <w:bookmarkStart w:id="71" w:name="python--m-lja.data.synth_generator"/>
     <w:p>
       <w:pPr>
         <w:pStyle w:val="Heading3"/>
@@ -10467,8 +10926,8 @@
         <w:t xml:space="preserve">.</w:t>
       </w:r>
     </w:p>
-    <w:bookmarkEnd w:id="67"/>
-    <w:bookmarkStart w:id="68" w:name="the-100-subject-cohort"/>
+    <w:bookmarkEnd w:id="71"/>
+    <w:bookmarkStart w:id="72" w:name="the-100-subject-cohort"/>
     <w:p>
       <w:pPr>
         <w:pStyle w:val="Heading3"/>
@@ -10500,9 +10959,9 @@
         <w:t xml:space="preserve">explains why it was built from the public handbook and gives the commands to rebuild it in about ten minutes. Part A’s three example students come from it.</w:t>
       </w:r>
     </w:p>
-    <w:bookmarkEnd w:id="68"/>
-    <w:bookmarkEnd w:id="69"/>
-    <w:bookmarkStart w:id="70" w:name="Xbe4eeb098a6407c22fba88ec8ffbd1d12bed7f2"/>
+    <w:bookmarkEnd w:id="72"/>
+    <w:bookmarkEnd w:id="73"/>
+    <w:bookmarkStart w:id="74" w:name="Xbe4eeb098a6407c22fba88ec8ffbd1d12bed7f2"/>
     <w:p>
       <w:pPr>
         <w:pStyle w:val="Heading2"/>
@@ -10843,9 +11302,9 @@
         </w:pict>
       </w:r>
     </w:p>
-    <w:bookmarkEnd w:id="70"/>
-    <w:bookmarkEnd w:id="71"/>
-    <w:bookmarkStart w:id="119" w:name="part-c.-using-the-dashboard"/>
+    <w:bookmarkEnd w:id="74"/>
+    <w:bookmarkEnd w:id="75"/>
+    <w:bookmarkStart w:id="123" w:name="part-c.-using-the-dashboard"/>
     <w:p>
       <w:pPr>
         <w:pStyle w:val="Heading1"/>
@@ -10931,7 +11390,7 @@
         <w:t xml:space="preserve">.</w:t>
       </w:r>
     </w:p>
-    <w:bookmarkStart w:id="72" w:name="starting-it-and-finding-your-way"/>
+    <w:bookmarkStart w:id="76" w:name="starting-it-and-finding-your-way"/>
     <w:p>
       <w:pPr>
         <w:pStyle w:val="Heading2"/>
@@ -11253,7 +11712,7 @@
           <w:bCs/>
           <w:b/>
         </w:rPr>
-        <w:t xml:space="preserve">This run</w:t>
+        <w:t xml:space="preserve">Provenance</w:t>
       </w:r>
       <w:r>
         <w:t xml:space="preserve"> </w:t>
@@ -11326,7 +11785,7 @@
         <w:pStyle w:val="Compact"/>
         <w:numPr>
           <w:ilvl w:val="0"/>
-          <w:numId w:val="1009"/>
+          <w:numId w:val="1010"/>
         </w:numPr>
       </w:pPr>
       <w:r>
@@ -11366,7 +11825,7 @@
         <w:pStyle w:val="Compact"/>
         <w:numPr>
           <w:ilvl w:val="0"/>
-          <w:numId w:val="1009"/>
+          <w:numId w:val="1010"/>
         </w:numPr>
       </w:pPr>
       <w:r>
@@ -11388,7 +11847,7 @@
         <w:pStyle w:val="Compact"/>
         <w:numPr>
           <w:ilvl w:val="0"/>
-          <w:numId w:val="1009"/>
+          <w:numId w:val="1010"/>
         </w:numPr>
       </w:pPr>
       <w:r>
@@ -11457,7 +11916,7 @@
         <w:pStyle w:val="Compact"/>
         <w:numPr>
           <w:ilvl w:val="0"/>
-          <w:numId w:val="1009"/>
+          <w:numId w:val="1010"/>
         </w:numPr>
       </w:pPr>
       <w:r>
@@ -11479,7 +11938,7 @@
         <w:pStyle w:val="Compact"/>
         <w:numPr>
           <w:ilvl w:val="0"/>
-          <w:numId w:val="1009"/>
+          <w:numId w:val="1010"/>
         </w:numPr>
       </w:pPr>
       <w:r>
@@ -11516,7 +11975,7 @@
         <w:pStyle w:val="Compact"/>
         <w:numPr>
           <w:ilvl w:val="0"/>
-          <w:numId w:val="1009"/>
+          <w:numId w:val="1010"/>
         </w:numPr>
       </w:pPr>
       <w:r>
@@ -11533,8 +11992,8 @@
         <w:t xml:space="preserve">carry the classification: red persistent gap, amber isolated gap, blue developing, green proficient. The chart colours never disagree with the badges.</w:t>
       </w:r>
     </w:p>
-    <w:bookmarkEnd w:id="72"/>
-    <w:bookmarkStart w:id="76" w:name="the-students-page"/>
+    <w:bookmarkEnd w:id="76"/>
+    <w:bookmarkStart w:id="80" w:name="the-students-page"/>
     <w:p>
       <w:pPr>
         <w:pStyle w:val="Heading2"/>
@@ -11561,18 +12020,18 @@
           <wp:inline>
             <wp:extent cx="3899556" cy="7919999"/>
             <wp:effectExtent b="0" l="0" r="0" t="0"/>
-            <wp:docPr descr="" title="" id="74" name="Picture"/>
+            <wp:docPr descr="" title="" id="78" name="Picture"/>
             <a:graphic>
               <a:graphicData uri="http://schemas.openxmlformats.org/drawingml/2006/picture">
                 <pic:pic>
                   <pic:nvPicPr>
-                    <pic:cNvPr descr="diagrams/14-page-students.png" id="75" name="Picture"/>
+                    <pic:cNvPr descr="diagrams/14-page-students.png" id="79" name="Picture"/>
                     <pic:cNvPicPr>
                       <a:picLocks noChangeArrowheads="1" noChangeAspect="1"/>
                     </pic:cNvPicPr>
                   </pic:nvPicPr>
                   <pic:blipFill>
-                    <a:blip r:embed="rId73"/>
+                    <a:blip r:embed="rId77"/>
                     <a:stretch>
                       <a:fillRect/>
                     </a:stretch>
@@ -11624,7 +12083,7 @@
         <w:pStyle w:val="Compact"/>
         <w:numPr>
           <w:ilvl w:val="0"/>
-          <w:numId w:val="1010"/>
+          <w:numId w:val="1011"/>
         </w:numPr>
       </w:pPr>
       <w:r>
@@ -11676,7 +12135,7 @@
         <w:pStyle w:val="Compact"/>
         <w:numPr>
           <w:ilvl w:val="0"/>
-          <w:numId w:val="1010"/>
+          <w:numId w:val="1011"/>
         </w:numPr>
       </w:pPr>
       <w:r>
@@ -11698,7 +12157,7 @@
         <w:pStyle w:val="Compact"/>
         <w:numPr>
           <w:ilvl w:val="0"/>
-          <w:numId w:val="1010"/>
+          <w:numId w:val="1011"/>
         </w:numPr>
       </w:pPr>
       <w:r>
@@ -11720,7 +12179,7 @@
         <w:pStyle w:val="Compact"/>
         <w:numPr>
           <w:ilvl w:val="0"/>
-          <w:numId w:val="1010"/>
+          <w:numId w:val="1011"/>
         </w:numPr>
       </w:pPr>
       <w:r>
@@ -11742,7 +12201,7 @@
         <w:pStyle w:val="Compact"/>
         <w:numPr>
           <w:ilvl w:val="0"/>
-          <w:numId w:val="1010"/>
+          <w:numId w:val="1011"/>
         </w:numPr>
       </w:pPr>
       <w:r>
@@ -11764,7 +12223,7 @@
         <w:pStyle w:val="Compact"/>
         <w:numPr>
           <w:ilvl w:val="0"/>
-          <w:numId w:val="1010"/>
+          <w:numId w:val="1011"/>
         </w:numPr>
       </w:pPr>
       <w:r>
@@ -11786,7 +12245,7 @@
         <w:pStyle w:val="Compact"/>
         <w:numPr>
           <w:ilvl w:val="0"/>
-          <w:numId w:val="1010"/>
+          <w:numId w:val="1011"/>
         </w:numPr>
       </w:pPr>
       <w:r>
@@ -11866,8 +12325,8 @@
         <w:t xml:space="preserve">Start with the 1st-priority list; those students have a mark under the floor in a competency and the case needs no statistics to make. The 2nd group is where the relative rule earns its keep: students doing well overall with one recurring soft spot. The 3rd group is for a subject coordinator rather than a course coordinator, since each flag comes from one subject.</w:t>
       </w:r>
     </w:p>
-    <w:bookmarkEnd w:id="76"/>
-    <w:bookmarkStart w:id="80" w:name="cohort-pages-cohortkey"/>
+    <w:bookmarkEnd w:id="80"/>
+    <w:bookmarkStart w:id="84" w:name="cohort-pages-cohortkey"/>
     <w:p>
       <w:pPr>
         <w:pStyle w:val="Heading2"/>
@@ -11894,18 +12353,18 @@
           <wp:inline>
             <wp:extent cx="4918872" cy="5759999"/>
             <wp:effectExtent b="0" l="0" r="0" t="0"/>
-            <wp:docPr descr="" title="" id="78" name="Picture"/>
+            <wp:docPr descr="" title="" id="82" name="Picture"/>
             <a:graphic>
               <a:graphicData uri="http://schemas.openxmlformats.org/drawingml/2006/picture">
                 <pic:pic>
                   <pic:nvPicPr>
-                    <pic:cNvPr descr="diagrams/14-page-cohort-priority-1.png" id="79" name="Picture"/>
+                    <pic:cNvPr descr="diagrams/14-page-cohort-priority-1.png" id="83" name="Picture"/>
                     <pic:cNvPicPr>
                       <a:picLocks noChangeArrowheads="1" noChangeAspect="1"/>
                     </pic:cNvPicPr>
                   </pic:nvPicPr>
                   <pic:blipFill>
-                    <a:blip r:embed="rId77"/>
+                    <a:blip r:embed="rId81"/>
                     <a:stretch>
                       <a:fillRect/>
                     </a:stretch>
@@ -12033,8 +12492,8 @@
         <w:t xml:space="preserve">cohort: the institution has no definition to match, and inventing one is the team’s decision under action A-01, not a dashboard default.</w:t>
       </w:r>
     </w:p>
-    <w:bookmarkEnd w:id="80"/>
-    <w:bookmarkStart w:id="84" w:name="a-students-page-studentid"/>
+    <w:bookmarkEnd w:id="84"/>
+    <w:bookmarkStart w:id="88" w:name="a-students-page-studentid"/>
     <w:p>
       <w:pPr>
         <w:pStyle w:val="Heading2"/>
@@ -12061,18 +12520,18 @@
           <wp:inline>
             <wp:extent cx="4223999" cy="7919999"/>
             <wp:effectExtent b="0" l="0" r="0" t="0"/>
-            <wp:docPr descr="" title="" id="82" name="Picture"/>
+            <wp:docPr descr="" title="" id="86" name="Picture"/>
             <a:graphic>
               <a:graphicData uri="http://schemas.openxmlformats.org/drawingml/2006/picture">
                 <pic:pic>
                   <pic:nvPicPr>
-                    <pic:cNvPr descr="diagrams/14-page-student.png" id="83" name="Picture"/>
+                    <pic:cNvPr descr="diagrams/14-page-student.png" id="87" name="Picture"/>
                     <pic:cNvPicPr>
                       <a:picLocks noChangeArrowheads="1" noChangeAspect="1"/>
                     </pic:cNvPicPr>
                   </pic:nvPicPr>
                   <pic:blipFill>
-                    <a:blip r:embed="rId81"/>
+                    <a:blip r:embed="rId85"/>
                     <a:stretch>
                       <a:fillRect/>
                     </a:stretch>
@@ -12124,7 +12583,7 @@
         <w:pStyle w:val="Compact"/>
         <w:numPr>
           <w:ilvl w:val="0"/>
-          <w:numId w:val="1011"/>
+          <w:numId w:val="1012"/>
         </w:numPr>
       </w:pPr>
       <w:r>
@@ -12146,7 +12605,7 @@
         <w:pStyle w:val="Compact"/>
         <w:numPr>
           <w:ilvl w:val="0"/>
-          <w:numId w:val="1011"/>
+          <w:numId w:val="1012"/>
         </w:numPr>
       </w:pPr>
       <w:r>
@@ -12183,7 +12642,7 @@
         <w:pStyle w:val="Compact"/>
         <w:numPr>
           <w:ilvl w:val="0"/>
-          <w:numId w:val="1011"/>
+          <w:numId w:val="1012"/>
         </w:numPr>
       </w:pPr>
       <w:r>
@@ -12205,7 +12664,7 @@
         <w:pStyle w:val="Compact"/>
         <w:numPr>
           <w:ilvl w:val="0"/>
-          <w:numId w:val="1011"/>
+          <w:numId w:val="1012"/>
         </w:numPr>
       </w:pPr>
       <w:r>
@@ -12252,7 +12711,7 @@
         <w:pStyle w:val="Compact"/>
         <w:numPr>
           <w:ilvl w:val="0"/>
-          <w:numId w:val="1011"/>
+          <w:numId w:val="1012"/>
         </w:numPr>
       </w:pPr>
       <w:r>
@@ -12355,7 +12814,7 @@
         <w:pStyle w:val="Compact"/>
         <w:numPr>
           <w:ilvl w:val="0"/>
-          <w:numId w:val="1011"/>
+          <w:numId w:val="1012"/>
         </w:numPr>
       </w:pPr>
       <w:r>
@@ -12584,7 +13043,7 @@
         <w:t xml:space="preserve"> </w:t>
       </w:r>
       <w:r>
-        <w:t xml:space="preserve">says the weakness showed in both first- and second-year subjects and will be assessed again in the capstone; the break before CSE3CAP is the time to work on it, with the learning plan and study strategy above. The chain is an ordering, not a forecast: two or three marks do not make a slope, and</w:t>
+        <w:t xml:space="preserve">says the weakness showed in both first- and second-year subjects and will be assessed again in the capstone; the break before CSE3CAP is the time to work on it, with the learning plan and study strategy above. Part A §4.5 draws one as a chart and explains what to read off it. The chain is an ordering, not a forecast: two or three marks do not make a slope, and</w:t>
       </w:r>
       <w:r>
         <w:t xml:space="preserve"> </w:t>
@@ -12605,8 +13064,8 @@
         <w:t xml:space="preserve">is where the competency comes up next, never a subject to avoid or a reason to change enrolment. On the reference run every student has sat all three subjects, so no chip is marked ahead; the marker appears on the larger synthetic cohorts and on any real cohort part-way through a degree.</w:t>
       </w:r>
     </w:p>
-    <w:bookmarkEnd w:id="84"/>
-    <w:bookmarkStart w:id="91" w:name="X8729c3c140c31030de4283e665f0ce9f4a7464f"/>
+    <w:bookmarkEnd w:id="88"/>
+    <w:bookmarkStart w:id="95" w:name="X8729c3c140c31030de4283e665f0ce9f4a7464f"/>
     <w:p>
       <w:pPr>
         <w:pStyle w:val="Heading2"/>
@@ -12633,18 +13092,18 @@
           <wp:inline>
             <wp:extent cx="4609475" cy="7199999"/>
             <wp:effectExtent b="0" l="0" r="0" t="0"/>
-            <wp:docPr descr="" title="" id="86" name="Picture"/>
+            <wp:docPr descr="" title="" id="90" name="Picture"/>
             <a:graphic>
               <a:graphicData uri="http://schemas.openxmlformats.org/drawingml/2006/picture">
                 <pic:pic>
                   <pic:nvPicPr>
-                    <pic:cNvPr descr="diagrams/14-page-outcome-quality.png" id="87" name="Picture"/>
+                    <pic:cNvPr descr="diagrams/14-page-outcome-quality.png" id="91" name="Picture"/>
                     <pic:cNvPicPr>
                       <a:picLocks noChangeArrowheads="1" noChangeAspect="1"/>
                     </pic:cNvPicPr>
                   </pic:nvPicPr>
                   <pic:blipFill>
-                    <a:blip r:embed="rId85"/>
+                    <a:blip r:embed="rId89"/>
                     <a:stretch>
                       <a:fillRect/>
                     </a:stretch>
@@ -12696,7 +13155,7 @@
         <w:pStyle w:val="Compact"/>
         <w:numPr>
           <w:ilvl w:val="0"/>
-          <w:numId w:val="1012"/>
+          <w:numId w:val="1013"/>
         </w:numPr>
       </w:pPr>
       <w:r>
@@ -12798,7 +13257,7 @@
         <w:pStyle w:val="Compact"/>
         <w:numPr>
           <w:ilvl w:val="0"/>
-          <w:numId w:val="1012"/>
+          <w:numId w:val="1013"/>
         </w:numPr>
       </w:pPr>
       <w:r>
@@ -12820,7 +13279,7 @@
         <w:pStyle w:val="Compact"/>
         <w:numPr>
           <w:ilvl w:val="0"/>
-          <w:numId w:val="1012"/>
+          <w:numId w:val="1013"/>
         </w:numPr>
       </w:pPr>
       <w:r>
@@ -12839,7 +13298,7 @@
         <w:pStyle w:val="Compact"/>
         <w:numPr>
           <w:ilvl w:val="0"/>
-          <w:numId w:val="1012"/>
+          <w:numId w:val="1013"/>
         </w:numPr>
       </w:pPr>
       <w:r>
@@ -12858,7 +13317,7 @@
         <w:pStyle w:val="Compact"/>
         <w:numPr>
           <w:ilvl w:val="0"/>
-          <w:numId w:val="1012"/>
+          <w:numId w:val="1013"/>
         </w:numPr>
       </w:pPr>
       <w:r>
@@ -12880,7 +13339,7 @@
         <w:pStyle w:val="Compact"/>
         <w:numPr>
           <w:ilvl w:val="0"/>
-          <w:numId w:val="1012"/>
+          <w:numId w:val="1013"/>
         </w:numPr>
       </w:pPr>
       <w:r>
@@ -12902,7 +13361,7 @@
         <w:pStyle w:val="Compact"/>
         <w:numPr>
           <w:ilvl w:val="0"/>
-          <w:numId w:val="1012"/>
+          <w:numId w:val="1013"/>
         </w:numPr>
       </w:pPr>
       <w:r>
@@ -12925,18 +13384,18 @@
           <wp:inline>
             <wp:extent cx="5334000" cy="3467099"/>
             <wp:effectExtent b="0" l="0" r="0" t="0"/>
-            <wp:docPr descr="" title="" id="89" name="Picture"/>
+            <wp:docPr descr="" title="" id="93" name="Picture"/>
             <a:graphic>
               <a:graphicData uri="http://schemas.openxmlformats.org/drawingml/2006/picture">
                 <pic:pic>
                   <pic:nvPicPr>
-                    <pic:cNvPr descr="diagrams/14-page-outcome-list-vague.png" id="90" name="Picture"/>
+                    <pic:cNvPr descr="diagrams/14-page-outcome-list-vague.png" id="94" name="Picture"/>
                     <pic:cNvPicPr>
                       <a:picLocks noChangeArrowheads="1" noChangeAspect="1"/>
                     </pic:cNvPicPr>
                   </pic:nvPicPr>
                   <pic:blipFill>
-                    <a:blip r:embed="rId88"/>
+                    <a:blip r:embed="rId92"/>
                     <a:stretch>
                       <a:fillRect/>
                     </a:stretch>
@@ -13058,8 +13517,8 @@
         <w:t xml:space="preserve">Send the vague list to the subject coordinators who wrote those outcomes: it is feedback on wording, not on students. Never-assessed outcomes are a mapping problem in the Assessment Map sheet. Orphan outcomes are not wrong, but nothing across the degree corroborates them.</w:t>
       </w:r>
     </w:p>
-    <w:bookmarkEnd w:id="91"/>
-    <w:bookmarkStart w:id="98" w:name="X3f63ded3088c79b74666254afcb43bc90b3af6d"/>
+    <w:bookmarkEnd w:id="95"/>
+    <w:bookmarkStart w:id="102" w:name="X3f63ded3088c79b74666254afcb43bc90b3af6d"/>
     <w:p>
       <w:pPr>
         <w:pStyle w:val="Heading2"/>
@@ -13086,18 +13545,18 @@
           <wp:inline>
             <wp:extent cx="4895999" cy="6119999"/>
             <wp:effectExtent b="0" l="0" r="0" t="0"/>
-            <wp:docPr descr="" title="" id="93" name="Picture"/>
+            <wp:docPr descr="" title="" id="97" name="Picture"/>
             <a:graphic>
               <a:graphicData uri="http://schemas.openxmlformats.org/drawingml/2006/picture">
                 <pic:pic>
                   <pic:nvPicPr>
-                    <pic:cNvPr descr="diagrams/14-page-competencies.png" id="94" name="Picture"/>
+                    <pic:cNvPr descr="diagrams/14-page-competencies.png" id="98" name="Picture"/>
                     <pic:cNvPicPr>
                       <a:picLocks noChangeArrowheads="1" noChangeAspect="1"/>
                     </pic:cNvPicPr>
                   </pic:nvPicPr>
                   <pic:blipFill>
-                    <a:blip r:embed="rId92"/>
+                    <a:blip r:embed="rId96"/>
                     <a:stretch>
                       <a:fillRect/>
                     </a:stretch>
@@ -13153,18 +13612,18 @@
           <wp:inline>
             <wp:extent cx="5120910" cy="7199999"/>
             <wp:effectExtent b="0" l="0" r="0" t="0"/>
-            <wp:docPr descr="" title="" id="96" name="Picture"/>
+            <wp:docPr descr="" title="" id="100" name="Picture"/>
             <a:graphic>
               <a:graphicData uri="http://schemas.openxmlformats.org/drawingml/2006/picture">
                 <pic:pic>
                   <pic:nvPicPr>
-                    <pic:cNvPr descr="diagrams/14-page-competency.png" id="97" name="Picture"/>
+                    <pic:cNvPr descr="diagrams/14-page-competency.png" id="101" name="Picture"/>
                     <pic:cNvPicPr>
                       <a:picLocks noChangeArrowheads="1" noChangeAspect="1"/>
                     </pic:cNvPicPr>
                   </pic:nvPicPr>
                   <pic:blipFill>
-                    <a:blip r:embed="rId95"/>
+                    <a:blip r:embed="rId99"/>
                     <a:stretch>
                       <a:fillRect/>
                     </a:stretch>
@@ -13226,8 +13685,8 @@
         <w:t xml:space="preserve">. Below it, for a competency taught in two or more subjects, attainment and gap rate by subject with a trend badge, and the model’s own explanation of why these outcomes were grouped.</w:t>
       </w:r>
     </w:p>
-    <w:bookmarkEnd w:id="98"/>
-    <w:bookmarkStart w:id="108" w:name="subjects-a-subject-and-assessments"/>
+    <w:bookmarkEnd w:id="102"/>
+    <w:bookmarkStart w:id="112" w:name="subjects-a-subject-and-assessments"/>
     <w:p>
       <w:pPr>
         <w:pStyle w:val="Heading2"/>
@@ -13245,18 +13704,18 @@
           <wp:inline>
             <wp:extent cx="5334000" cy="4171188"/>
             <wp:effectExtent b="0" l="0" r="0" t="0"/>
-            <wp:docPr descr="" title="" id="100" name="Picture"/>
+            <wp:docPr descr="" title="" id="104" name="Picture"/>
             <a:graphic>
               <a:graphicData uri="http://schemas.openxmlformats.org/drawingml/2006/picture">
                 <pic:pic>
                   <pic:nvPicPr>
-                    <pic:cNvPr descr="diagrams/14-page-subjects.png" id="101" name="Picture"/>
+                    <pic:cNvPr descr="diagrams/14-page-subjects.png" id="105" name="Picture"/>
                     <pic:cNvPicPr>
                       <a:picLocks noChangeArrowheads="1" noChangeAspect="1"/>
                     </pic:cNvPicPr>
                   </pic:nvPicPr>
                   <pic:blipFill>
-                    <a:blip r:embed="rId99"/>
+                    <a:blip r:embed="rId103"/>
                     <a:stretch>
                       <a:fillRect/>
                     </a:stretch>
@@ -13304,18 +13763,18 @@
           <wp:inline>
             <wp:extent cx="4940530" cy="5399999"/>
             <wp:effectExtent b="0" l="0" r="0" t="0"/>
-            <wp:docPr descr="" title="" id="103" name="Picture"/>
+            <wp:docPr descr="" title="" id="107" name="Picture"/>
             <a:graphic>
               <a:graphicData uri="http://schemas.openxmlformats.org/drawingml/2006/picture">
                 <pic:pic>
                   <pic:nvPicPr>
-                    <pic:cNvPr descr="diagrams/14-page-subject.png" id="104" name="Picture"/>
+                    <pic:cNvPr descr="diagrams/14-page-subject.png" id="108" name="Picture"/>
                     <pic:cNvPicPr>
                       <a:picLocks noChangeArrowheads="1" noChangeAspect="1"/>
                     </pic:cNvPicPr>
                   </pic:nvPicPr>
                   <pic:blipFill>
-                    <a:blip r:embed="rId102"/>
+                    <a:blip r:embed="rId106"/>
                     <a:stretch>
                       <a:fillRect/>
                     </a:stretch>
@@ -13363,18 +13822,18 @@
           <wp:inline>
             <wp:extent cx="4940530" cy="5399999"/>
             <wp:effectExtent b="0" l="0" r="0" t="0"/>
-            <wp:docPr descr="" title="" id="106" name="Picture"/>
+            <wp:docPr descr="" title="" id="110" name="Picture"/>
             <a:graphic>
               <a:graphicData uri="http://schemas.openxmlformats.org/drawingml/2006/picture">
                 <pic:pic>
                   <pic:nvPicPr>
-                    <pic:cNvPr descr="diagrams/14-page-assessments.png" id="107" name="Picture"/>
+                    <pic:cNvPr descr="diagrams/14-page-assessments.png" id="111" name="Picture"/>
                     <pic:cNvPicPr>
                       <a:picLocks noChangeArrowheads="1" noChangeAspect="1"/>
                     </pic:cNvPicPr>
                   </pic:nvPicPr>
                   <pic:blipFill>
-                    <a:blip r:embed="rId105"/>
+                    <a:blip r:embed="rId109"/>
                     <a:stretch>
                       <a:fillRect/>
                     </a:stretch>
@@ -13487,14 +13946,14 @@
         <w:t xml:space="preserve">A high-weight assessment with a low mean and many SILOs attached moves a lot of students’ classifications at once; that is where to look first when a competency’s gap rate looks wrong.</w:t>
       </w:r>
     </w:p>
-    <w:bookmarkEnd w:id="108"/>
-    <w:bookmarkStart w:id="112" w:name="this-run-run"/>
+    <w:bookmarkEnd w:id="112"/>
+    <w:bookmarkStart w:id="116" w:name="provenance-run"/>
     <w:p>
       <w:pPr>
         <w:pStyle w:val="Heading2"/>
       </w:pPr>
       <w:r>
-        <w:t xml:space="preserve">20. This run (</w:t>
+        <w:t xml:space="preserve">20. Provenance (</w:t>
       </w:r>
       <w:r>
         <w:rPr>
@@ -13515,18 +13974,18 @@
           <wp:inline>
             <wp:extent cx="5070422" cy="7919999"/>
             <wp:effectExtent b="0" l="0" r="0" t="0"/>
-            <wp:docPr descr="" title="" id="110" name="Picture"/>
+            <wp:docPr descr="" title="" id="114" name="Picture"/>
             <a:graphic>
               <a:graphicData uri="http://schemas.openxmlformats.org/drawingml/2006/picture">
                 <pic:pic>
                   <pic:nvPicPr>
-                    <pic:cNvPr descr="diagrams/14-page-this-run.png" id="111" name="Picture"/>
+                    <pic:cNvPr descr="diagrams/14-page-this-run.png" id="115" name="Picture"/>
                     <pic:cNvPicPr>
                       <a:picLocks noChangeArrowheads="1" noChangeAspect="1"/>
                     </pic:cNvPicPr>
                   </pic:nvPicPr>
                   <pic:blipFill>
-                    <a:blip r:embed="rId109"/>
+                    <a:blip r:embed="rId113"/>
                     <a:stretch>
                       <a:fillRect/>
                     </a:stretch>
@@ -13562,7 +14021,49 @@
           <w:iCs/>
           <w:i/>
         </w:rPr>
-        <w:t xml:space="preserve">Figure 16: This run: the command, the files, the input counts, the rules and the parameter values that produced every other page.</w:t>
+        <w:t xml:space="preserve">Figure 16: Provenance (titled</w:t>
+      </w:r>
+      <w:r>
+        <w:rPr>
+          <w:iCs/>
+          <w:i/>
+        </w:rPr>
+        <w:t xml:space="preserve"> </w:t>
+      </w:r>
+      <w:r>
+        <w:rPr>
+          <w:iCs/>
+          <w:i/>
+        </w:rPr>
+        <w:t xml:space="preserve">“</w:t>
+      </w:r>
+      <w:r>
+        <w:rPr>
+          <w:iCs/>
+          <w:i/>
+        </w:rPr>
+        <w:t xml:space="preserve">This run</w:t>
+      </w:r>
+      <w:r>
+        <w:rPr>
+          <w:iCs/>
+          <w:i/>
+        </w:rPr>
+        <w:t xml:space="preserve">”</w:t>
+      </w:r>
+      <w:r>
+        <w:rPr>
+          <w:iCs/>
+          <w:i/>
+        </w:rPr>
+        <w:t xml:space="preserve"> </w:t>
+      </w:r>
+      <w:r>
+        <w:rPr>
+          <w:iCs/>
+          <w:i/>
+        </w:rPr>
+        <w:t xml:space="preserve">when the screenshot was taken; renamed in PR #54): the command, the files, the input counts, the rules and the parameter values that produced every other page.</w:t>
       </w:r>
     </w:p>
     <w:p>
@@ -13570,7 +14071,22 @@
         <w:pStyle w:val="BodyText"/>
       </w:pPr>
       <w:r>
-        <w:t xml:space="preserve">Open this page before quoting any number from the dashboard. It shows the exact command that started it, when, the git version, the workbook, cache and review file; linked input counts; the classification rules as an ordered list with this run’s values; a table with one row per threshold giving the value used, the code default, the environment variable, the CLI flag, and a mark on anything that differs from the default; a histogram of where the flagged marks sit; and, for a synthetic cohort, the generator’s seed and parameters. A further table,</w:t>
+        <w:t xml:space="preserve">Open this page before quoting any number from the dashboard. It opens with the pipeline command that reproduces its numbers as files,</w:t>
+      </w:r>
+      <w:r>
+        <w:t xml:space="preserve"> </w:t>
+      </w:r>
+      <w:r>
+        <w:rPr>
+          <w:rStyle w:val="VerbatimChar"/>
+        </w:rPr>
+        <w:t xml:space="preserve">python -m lja.cli</w:t>
+      </w:r>
+      <w:r>
+        <w:t xml:space="preserve"> </w:t>
+      </w:r>
+      <w:r>
+        <w:t xml:space="preserve">with the same workbook, cache, review file and any changed threshold (PR #54). Then it shows the exact command that started the dashboard, when, the git version, the workbook, cache and review file; linked input counts; the classification rules as an ordered list with this run’s values; a table with one row per threshold giving the value used, the code default, the environment variable, the CLI flag, and a mark on anything that differs from the default; a histogram of where the flagged marks sit; and, for a synthetic cohort, the generator’s seed and parameters. A further table,</w:t>
       </w:r>
       <w:r>
         <w:t xml:space="preserve"> </w:t>
@@ -13586,8 +14102,8 @@
         <w:t xml:space="preserve">, shows the declared sequence, the stable band, and how many of this run’s subjects were not in the sequence and so were placed by their year digit. When the thresholds are ratified under action A-01, this is where the ratified values will be visible.</w:t>
       </w:r>
     </w:p>
-    <w:bookmarkEnd w:id="112"/>
-    <w:bookmarkStart w:id="116" w:name="glossary-glossary"/>
+    <w:bookmarkEnd w:id="116"/>
+    <w:bookmarkStart w:id="120" w:name="glossary-glossary"/>
     <w:p>
       <w:pPr>
         <w:pStyle w:val="Heading2"/>
@@ -13614,18 +14130,18 @@
           <wp:inline>
             <wp:extent cx="4940530" cy="5399999"/>
             <wp:effectExtent b="0" l="0" r="0" t="0"/>
-            <wp:docPr descr="" title="" id="114" name="Picture"/>
+            <wp:docPr descr="" title="" id="118" name="Picture"/>
             <a:graphic>
               <a:graphicData uri="http://schemas.openxmlformats.org/drawingml/2006/picture">
                 <pic:pic>
                   <pic:nvPicPr>
-                    <pic:cNvPr descr="diagrams/14-page-glossary.png" id="115" name="Picture"/>
+                    <pic:cNvPr descr="diagrams/14-page-glossary.png" id="119" name="Picture"/>
                     <pic:cNvPicPr>
                       <a:picLocks noChangeArrowheads="1" noChangeAspect="1"/>
                     </pic:cNvPicPr>
                   </pic:nvPicPr>
                   <pic:blipFill>
-                    <a:blip r:embed="rId113"/>
+                    <a:blip r:embed="rId117"/>
                     <a:stretch>
                       <a:fillRect/>
                     </a:stretch>
@@ -13700,8 +14216,8 @@
         <w:t xml:space="preserve">rather than re-defining terms.</w:t>
       </w:r>
     </w:p>
-    <w:bookmarkEnd w:id="116"/>
-    <w:bookmarkStart w:id="117" w:name="typical-tasks"/>
+    <w:bookmarkEnd w:id="120"/>
+    <w:bookmarkStart w:id="121" w:name="typical-tasks"/>
     <w:p>
       <w:pPr>
         <w:pStyle w:val="Heading2"/>
@@ -13867,7 +14383,7 @@
               <w:jc w:val="left"/>
             </w:pPr>
             <w:r>
-              <w:t xml:space="preserve">This run: confirm the thresholds, then the student’s basis line (floor is settings-independent; relative depends on MAD)</w:t>
+              <w:t xml:space="preserve">Provenance: confirm the thresholds, then the student’s basis line (floor is settings-independent; relative depends on MAD)</w:t>
             </w:r>
           </w:p>
         </w:tc>
@@ -14016,8 +14532,8 @@
         </w:tc>
       </w:tr>
     </w:tbl>
-    <w:bookmarkEnd w:id="117"/>
-    <w:bookmarkStart w:id="118" w:name="what-the-dashboard-does-not-do-yet"/>
+    <w:bookmarkEnd w:id="121"/>
+    <w:bookmarkStart w:id="122" w:name="what-the-dashboard-does-not-do-yet"/>
     <w:p>
       <w:pPr>
         <w:pStyle w:val="Heading2"/>
@@ -14031,7 +14547,7 @@
         <w:pStyle w:val="Compact"/>
         <w:numPr>
           <w:ilvl w:val="0"/>
-          <w:numId w:val="1013"/>
+          <w:numId w:val="1014"/>
         </w:numPr>
       </w:pPr>
       <w:r>
@@ -14043,7 +14559,7 @@
         <w:pStyle w:val="Compact"/>
         <w:numPr>
           <w:ilvl w:val="0"/>
-          <w:numId w:val="1013"/>
+          <w:numId w:val="1014"/>
         </w:numPr>
       </w:pPr>
       <w:r>
@@ -14055,7 +14571,7 @@
         <w:pStyle w:val="Compact"/>
         <w:numPr>
           <w:ilvl w:val="0"/>
-          <w:numId w:val="1013"/>
+          <w:numId w:val="1014"/>
         </w:numPr>
       </w:pPr>
       <w:r>
@@ -14085,7 +14601,7 @@
         <w:pStyle w:val="Compact"/>
         <w:numPr>
           <w:ilvl w:val="0"/>
-          <w:numId w:val="1013"/>
+          <w:numId w:val="1014"/>
         </w:numPr>
       </w:pPr>
       <w:r>
@@ -14107,7 +14623,7 @@
         <w:t xml:space="preserve"> </w:t>
       </w:r>
       <w:r>
-        <w:t xml:space="preserve">of a student are inferred from the competency’s subjects they have no results in, not from enrolment records. Reading next semester’s enrolments from Moodle would make it a fact; that is not built.</w:t>
+        <w:t xml:space="preserve">of a student are inferred from the competency’s subjects they have no results in, not from enrolment records or a course map, so on a large cohort they include subjects from other degrees (Part A §4.5). Reading next semester’s enrolments from Moodle, or a course map per degree, would make it a fact; neither is built.</w:t>
       </w:r>
     </w:p>
     <w:p>
@@ -14115,7 +14631,7 @@
         <w:pStyle w:val="Compact"/>
         <w:numPr>
           <w:ilvl w:val="0"/>
-          <w:numId w:val="1013"/>
+          <w:numId w:val="1014"/>
         </w:numPr>
       </w:pPr>
       <w:r>
@@ -14139,7 +14655,7 @@
         <w:pStyle w:val="Compact"/>
         <w:numPr>
           <w:ilvl w:val="0"/>
-          <w:numId w:val="1013"/>
+          <w:numId w:val="1014"/>
         </w:numPr>
       </w:pPr>
       <w:r>
@@ -14169,7 +14685,7 @@
         <w:pStyle w:val="Compact"/>
         <w:numPr>
           <w:ilvl w:val="0"/>
-          <w:numId w:val="1013"/>
+          <w:numId w:val="1014"/>
         </w:numPr>
       </w:pPr>
       <w:r>
@@ -14181,7 +14697,7 @@
         <w:pStyle w:val="Compact"/>
         <w:numPr>
           <w:ilvl w:val="0"/>
-          <w:numId w:val="1013"/>
+          <w:numId w:val="1014"/>
         </w:numPr>
       </w:pPr>
       <w:r>
@@ -14268,7 +14784,7 @@
         <w:pStyle w:val="Compact"/>
         <w:numPr>
           <w:ilvl w:val="0"/>
-          <w:numId w:val="1013"/>
+          <w:numId w:val="1014"/>
         </w:numPr>
       </w:pPr>
       <w:r>
@@ -14280,7 +14796,7 @@
         <w:pStyle w:val="Compact"/>
         <w:numPr>
           <w:ilvl w:val="0"/>
-          <w:numId w:val="1013"/>
+          <w:numId w:val="1014"/>
         </w:numPr>
       </w:pPr>
       <w:r>
@@ -14304,9 +14820,9 @@
         </w:pict>
       </w:r>
     </w:p>
-    <w:bookmarkEnd w:id="118"/>
-    <w:bookmarkEnd w:id="119"/>
-    <w:bookmarkStart w:id="123" w:name="appendices"/>
+    <w:bookmarkEnd w:id="122"/>
+    <w:bookmarkEnd w:id="123"/>
+    <w:bookmarkStart w:id="127" w:name="appendices"/>
     <w:p>
       <w:pPr>
         <w:pStyle w:val="Heading1"/>
@@ -14315,7 +14831,7 @@
         <w:t xml:space="preserve">Appendices</w:t>
       </w:r>
     </w:p>
-    <w:bookmarkStart w:id="120" w:name="X44d6f023efc14423cc88343ad09a51d93b72afb"/>
+    <w:bookmarkStart w:id="124" w:name="X44d6f023efc14423cc88343ad09a51d93b72afb"/>
     <w:p>
       <w:pPr>
         <w:pStyle w:val="Heading2"/>
@@ -14507,8 +15023,8 @@
         <w:t xml:space="preserve">as files 11 to 14.</w:t>
       </w:r>
     </w:p>
-    <w:bookmarkEnd w:id="120"/>
-    <w:bookmarkStart w:id="121" w:name="appendix-b.-open-items-in-this-draft"/>
+    <w:bookmarkEnd w:id="124"/>
+    <w:bookmarkStart w:id="125" w:name="appendix-b.-open-items-in-this-draft"/>
     <w:p>
       <w:pPr>
         <w:pStyle w:val="Heading2"/>
@@ -14849,8 +15365,8 @@
         </w:tc>
       </w:tr>
     </w:tbl>
-    <w:bookmarkEnd w:id="121"/>
-    <w:bookmarkStart w:id="122" w:name="appendix-c.-change-log"/>
+    <w:bookmarkEnd w:id="125"/>
+    <w:bookmarkStart w:id="126" w:name="appendix-c.-change-log"/>
     <w:p>
       <w:pPr>
         <w:pStyle w:val="Heading2"/>
@@ -15165,14 +15681,14 @@
               <w:jc w:val="left"/>
             </w:pPr>
             <w:r>
-              <w:t xml:space="preserve">IOLG-106: the subject sequence and trend band settings (§5.2), the subject chain on every gap card and how to read it (§16), the subject-order table on This run (§20), the glossary entry (§21), a typical task (§22) and the limits (§23). Marked (IOLG-106); ships on that branch.</w:t>
+              <w:t xml:space="preserve">IOLG-106: Part A §4.5 explains the trajectory with a worked chart (Figure 5b, STU0834) and the large-cohort caveat; the subject sequence and trend band settings (§5.2), the subject chain on every gap card and how to read it (§16), the subject-order table on This run (§20), the glossary entry (§21), a typical task (§22) and the limits (§23). Marked (IOLG-106); ships on that branch.</w:t>
             </w:r>
           </w:p>
         </w:tc>
       </w:tr>
     </w:tbl>
-    <w:bookmarkEnd w:id="122"/>
-    <w:bookmarkEnd w:id="123"/>
+    <w:bookmarkEnd w:id="126"/>
+    <w:bookmarkEnd w:id="127"/>
     <w:sectPr/>
   </w:body>
 </w:document>
@@ -15600,12 +16116,6 @@
     </w:lvlOverride>
   </w:num>
   <w:num w:numId="1008">
-    <w:abstractNumId w:val="991"/>
-  </w:num>
-  <w:num w:numId="1009">
-    <w:abstractNumId w:val="991"/>
-  </w:num>
-  <w:num w:numId="1010">
     <w:abstractNumId w:val="99411"/>
     <w:lvlOverride w:ilvl="0">
       <w:startOverride w:val="1"/>
@@ -15635,13 +16145,49 @@
       <w:startOverride w:val="1"/>
     </w:lvlOverride>
   </w:num>
+  <w:num w:numId="1009">
+    <w:abstractNumId w:val="991"/>
+  </w:num>
+  <w:num w:numId="1010">
+    <w:abstractNumId w:val="991"/>
+  </w:num>
   <w:num w:numId="1011">
-    <w:abstractNumId w:val="991"/>
+    <w:abstractNumId w:val="99411"/>
+    <w:lvlOverride w:ilvl="0">
+      <w:startOverride w:val="1"/>
+    </w:lvlOverride>
+    <w:lvlOverride w:ilvl="1">
+      <w:startOverride w:val="1"/>
+    </w:lvlOverride>
+    <w:lvlOverride w:ilvl="2">
+      <w:startOverride w:val="1"/>
+    </w:lvlOverride>
+    <w:lvlOverride w:ilvl="3">
+      <w:startOverride w:val="1"/>
+    </w:lvlOverride>
+    <w:lvlOverride w:ilvl="4">
+      <w:startOverride w:val="1"/>
+    </w:lvlOverride>
+    <w:lvlOverride w:ilvl="5">
+      <w:startOverride w:val="1"/>
+    </w:lvlOverride>
+    <w:lvlOverride w:ilvl="6">
+      <w:startOverride w:val="1"/>
+    </w:lvlOverride>
+    <w:lvlOverride w:ilvl="7">
+      <w:startOverride w:val="1"/>
+    </w:lvlOverride>
+    <w:lvlOverride w:ilvl="8">
+      <w:startOverride w:val="1"/>
+    </w:lvlOverride>
   </w:num>
   <w:num w:numId="1012">
     <w:abstractNumId w:val="991"/>
   </w:num>
   <w:num w:numId="1013">
+    <w:abstractNumId w:val="991"/>
+  </w:num>
+  <w:num w:numId="1014">
     <w:abstractNumId w:val="991"/>
   </w:num>
 </w:numbering>

</xml_diff>